<commit_message>
modified:   Isolation/Editfile.rou.xml 	modified:   PPT's/algorithm.docx
</commit_message>
<xml_diff>
--- a/PPT's/algorithm.docx
+++ b/PPT's/algorithm.docx
@@ -141,6 +141,7 @@
       </w:pPr>
       <w:r>
         <w:rPr>
+          <w:color w:val="EE0000"/>
           <w:sz w:val="28"/>
           <w:szCs w:val="28"/>
         </w:rPr>
@@ -184,6 +185,22 @@
         </w:rPr>
         <w:t xml:space="preserve">Handling multiple emergency vehicles according to their priority. </w:t>
       </w:r>
+      <w:r>
+        <w:rPr>
+          <w:sz w:val="28"/>
+          <w:szCs w:val="28"/>
+        </w:rPr>
+        <w:t xml:space="preserve">(max </w:t>
+      </w:r>
+      <w:proofErr w:type="gramStart"/>
+      <w:r>
+        <w:rPr>
+          <w:sz w:val="28"/>
+          <w:szCs w:val="28"/>
+        </w:rPr>
+        <w:t>2 )</w:t>
+      </w:r>
+      <w:proofErr w:type="gramEnd"/>
     </w:p>
     <w:p>
       <w:pPr>
@@ -255,7 +272,7 @@
           <w:szCs w:val="28"/>
         </w:rPr>
         <w:pict w14:anchorId="4B1FCAA4">
-          <v:rect id="_x0000_i1211" style="width:0;height:1.5pt" o:hralign="center" o:hrstd="t" o:hr="t" fillcolor="#a0a0a0" stroked="f"/>
+          <v:rect id="_x0000_i1025" style="width:0;height:1.5pt" o:hralign="center" o:hrstd="t" o:hr="t" fillcolor="#a0a0a0" stroked="f"/>
         </w:pict>
       </w:r>
     </w:p>
@@ -445,7 +462,7 @@
           <w:szCs w:val="28"/>
         </w:rPr>
         <w:pict w14:anchorId="1DADC408">
-          <v:rect id="_x0000_i1212" style="width:0;height:1.5pt" o:hralign="center" o:hrstd="t" o:hr="t" fillcolor="#a0a0a0" stroked="f"/>
+          <v:rect id="_x0000_i1026" style="width:0;height:1.5pt" o:hralign="center" o:hrstd="t" o:hr="t" fillcolor="#a0a0a0" stroked="f"/>
         </w:pict>
       </w:r>
     </w:p>
@@ -454,6 +471,7 @@
         <w:rPr>
           <w:b/>
           <w:bCs/>
+          <w:color w:val="EE0000"/>
           <w:sz w:val="28"/>
           <w:szCs w:val="28"/>
         </w:rPr>
@@ -462,6 +480,7 @@
         <w:rPr>
           <w:b/>
           <w:bCs/>
+          <w:color w:val="EE0000"/>
           <w:sz w:val="28"/>
           <w:szCs w:val="28"/>
         </w:rPr>
@@ -526,7 +545,7 @@
           <w:szCs w:val="28"/>
         </w:rPr>
         <w:pict w14:anchorId="2E462134">
-          <v:rect id="_x0000_i1213" style="width:0;height:1.5pt" o:hralign="center" o:hrstd="t" o:hr="t" fillcolor="#a0a0a0" stroked="f"/>
+          <v:rect id="_x0000_i1027" style="width:0;height:1.5pt" o:hralign="center" o:hrstd="t" o:hr="t" fillcolor="#a0a0a0" stroked="f"/>
         </w:pict>
       </w:r>
     </w:p>
@@ -682,7 +701,7 @@
           <w:szCs w:val="28"/>
         </w:rPr>
         <w:pict w14:anchorId="53748781">
-          <v:rect id="_x0000_i1214" style="width:0;height:1.5pt" o:hralign="center" o:hrstd="t" o:hr="t" fillcolor="#a0a0a0" stroked="f"/>
+          <v:rect id="_x0000_i1028" style="width:0;height:1.5pt" o:hralign="center" o:hrstd="t" o:hr="t" fillcolor="#a0a0a0" stroked="f"/>
         </w:pict>
       </w:r>
     </w:p>
@@ -885,7 +904,7 @@
           <w:szCs w:val="28"/>
         </w:rPr>
         <w:pict w14:anchorId="387F41DF">
-          <v:rect id="_x0000_i1215" style="width:0;height:1.5pt" o:hralign="center" o:hrstd="t" o:hr="t" fillcolor="#a0a0a0" stroked="f"/>
+          <v:rect id="_x0000_i1029" style="width:0;height:1.5pt" o:hralign="center" o:hrstd="t" o:hr="t" fillcolor="#a0a0a0" stroked="f"/>
         </w:pict>
       </w:r>
     </w:p>
@@ -1115,7 +1134,7 @@
           <w:szCs w:val="28"/>
         </w:rPr>
         <w:pict w14:anchorId="050ED1F8">
-          <v:rect id="_x0000_i1216" style="width:0;height:1.5pt" o:hralign="center" o:hrstd="t" o:hr="t" fillcolor="#a0a0a0" stroked="f"/>
+          <v:rect id="_x0000_i1030" style="width:0;height:1.5pt" o:hralign="center" o:hrstd="t" o:hr="t" fillcolor="#a0a0a0" stroked="f"/>
         </w:pict>
       </w:r>
     </w:p>
@@ -1271,7 +1290,7 @@
           <w:szCs w:val="28"/>
         </w:rPr>
         <w:pict w14:anchorId="2499D549">
-          <v:rect id="_x0000_i1217" style="width:0;height:1.5pt" o:hralign="center" o:hrstd="t" o:hr="t" fillcolor="#a0a0a0" stroked="f"/>
+          <v:rect id="_x0000_i1031" style="width:0;height:1.5pt" o:hralign="center" o:hrstd="t" o:hr="t" fillcolor="#a0a0a0" stroked="f"/>
         </w:pict>
       </w:r>
     </w:p>
@@ -1543,7 +1562,7 @@
           <w:szCs w:val="28"/>
         </w:rPr>
         <w:pict w14:anchorId="3C982238">
-          <v:rect id="_x0000_i1218" style="width:0;height:1.5pt" o:hralign="center" o:hrstd="t" o:hr="t" fillcolor="#a0a0a0" stroked="f"/>
+          <v:rect id="_x0000_i1032" style="width:0;height:1.5pt" o:hralign="center" o:hrstd="t" o:hr="t" fillcolor="#a0a0a0" stroked="f"/>
         </w:pict>
       </w:r>
     </w:p>
@@ -1563,236 +1582,236 @@
           <w:sz w:val="28"/>
           <w:szCs w:val="28"/>
         </w:rPr>
-        <w:t>Assumption 8 – Minimum and Maximum Green Time</w:t>
-      </w:r>
-    </w:p>
-    <w:p>
-      <w:pPr>
-        <w:rPr>
-          <w:sz w:val="28"/>
-          <w:szCs w:val="28"/>
-        </w:rPr>
-      </w:pPr>
-      <w:r>
-        <w:rPr>
-          <w:sz w:val="28"/>
-          <w:szCs w:val="28"/>
-        </w:rPr>
-        <w:t>Every lane has:</w:t>
-      </w:r>
-    </w:p>
-    <w:p>
-      <w:pPr>
-        <w:rPr>
-          <w:sz w:val="28"/>
-          <w:szCs w:val="28"/>
-        </w:rPr>
-      </w:pPr>
-      <w:r>
-        <w:rPr>
-          <w:sz w:val="28"/>
-          <w:szCs w:val="28"/>
-        </w:rPr>
-        <w:t>MIN_GREEN_TIME</w:t>
-      </w:r>
-    </w:p>
-    <w:p>
-      <w:pPr>
-        <w:rPr>
-          <w:sz w:val="28"/>
-          <w:szCs w:val="28"/>
-        </w:rPr>
-      </w:pPr>
-      <w:r>
-        <w:rPr>
-          <w:sz w:val="28"/>
-          <w:szCs w:val="28"/>
-        </w:rPr>
-        <w:t>MAX_GREEN_TIME</w:t>
-      </w:r>
-    </w:p>
-    <w:p>
-      <w:pPr>
-        <w:rPr>
-          <w:sz w:val="28"/>
-          <w:szCs w:val="28"/>
-        </w:rPr>
-      </w:pPr>
-      <w:r>
-        <w:rPr>
-          <w:sz w:val="28"/>
-          <w:szCs w:val="28"/>
-        </w:rPr>
-        <w:t>For example:</w:t>
-      </w:r>
-    </w:p>
-    <w:p>
-      <w:pPr>
-        <w:rPr>
-          <w:sz w:val="28"/>
-          <w:szCs w:val="28"/>
-        </w:rPr>
-      </w:pPr>
-      <w:r>
-        <w:rPr>
-          <w:sz w:val="28"/>
-          <w:szCs w:val="28"/>
-        </w:rPr>
-        <w:t>Minimum = 10 sec</w:t>
-      </w:r>
-    </w:p>
-    <w:p>
-      <w:pPr>
-        <w:rPr>
-          <w:sz w:val="28"/>
-          <w:szCs w:val="28"/>
-        </w:rPr>
-      </w:pPr>
-      <w:r>
-        <w:rPr>
-          <w:sz w:val="28"/>
-          <w:szCs w:val="28"/>
-        </w:rPr>
-        <w:t>Maximum = 50 sec</w:t>
-      </w:r>
-    </w:p>
-    <w:p>
-      <w:pPr>
-        <w:rPr>
-          <w:sz w:val="28"/>
-          <w:szCs w:val="28"/>
-        </w:rPr>
-      </w:pPr>
-      <w:r>
-        <w:rPr>
-          <w:sz w:val="28"/>
-          <w:szCs w:val="28"/>
-        </w:rPr>
-        <w:t>The exact values can be adjusted during testing.</w:t>
-      </w:r>
-    </w:p>
-    <w:p>
-      <w:pPr>
-        <w:rPr>
-          <w:sz w:val="28"/>
-          <w:szCs w:val="28"/>
-        </w:rPr>
-      </w:pPr>
-      <w:r>
-        <w:rPr>
-          <w:sz w:val="28"/>
-          <w:szCs w:val="28"/>
-        </w:rPr>
-        <w:t>This prevents extremely short or excessively long green phases.</w:t>
-      </w:r>
-    </w:p>
-    <w:p>
-      <w:pPr>
-        <w:rPr>
-          <w:sz w:val="28"/>
-          <w:szCs w:val="28"/>
-        </w:rPr>
-      </w:pPr>
-      <w:r>
-        <w:rPr>
-          <w:sz w:val="28"/>
-          <w:szCs w:val="28"/>
-        </w:rPr>
-        <w:pict w14:anchorId="336589DF">
-          <v:rect id="_x0000_i1219" style="width:0;height:1.5pt" o:hralign="center" o:hrstd="t" o:hr="t" fillcolor="#a0a0a0" stroked="f"/>
-        </w:pict>
-      </w:r>
-    </w:p>
-    <w:p>
-      <w:pPr>
+        <w:t xml:space="preserve">Assumption 8 – </w:t>
+      </w:r>
+      <w:r>
         <w:rPr>
           <w:b/>
           <w:bCs/>
-          <w:sz w:val="28"/>
-          <w:szCs w:val="28"/>
-        </w:rPr>
-      </w:pPr>
-      <w:r>
+          <w:color w:val="EE0000"/>
+          <w:sz w:val="28"/>
+          <w:szCs w:val="28"/>
+        </w:rPr>
+        <w:t>Minimum and Maximum Green Time</w:t>
+      </w:r>
+    </w:p>
+    <w:p>
+      <w:pPr>
+        <w:rPr>
+          <w:sz w:val="28"/>
+          <w:szCs w:val="28"/>
+        </w:rPr>
+      </w:pPr>
+      <w:r>
+        <w:rPr>
+          <w:sz w:val="28"/>
+          <w:szCs w:val="28"/>
+        </w:rPr>
+        <w:t>Every lane has:</w:t>
+      </w:r>
+    </w:p>
+    <w:p>
+      <w:pPr>
+        <w:rPr>
+          <w:sz w:val="28"/>
+          <w:szCs w:val="28"/>
+        </w:rPr>
+      </w:pPr>
+      <w:r>
+        <w:rPr>
+          <w:sz w:val="28"/>
+          <w:szCs w:val="28"/>
+        </w:rPr>
+        <w:t>MIN_GREEN_TIME</w:t>
+      </w:r>
+    </w:p>
+    <w:p>
+      <w:pPr>
+        <w:rPr>
+          <w:sz w:val="28"/>
+          <w:szCs w:val="28"/>
+        </w:rPr>
+      </w:pPr>
+      <w:r>
+        <w:rPr>
+          <w:sz w:val="28"/>
+          <w:szCs w:val="28"/>
+        </w:rPr>
+        <w:t>MAX_GREEN_TIME</w:t>
+      </w:r>
+    </w:p>
+    <w:p>
+      <w:pPr>
+        <w:rPr>
+          <w:sz w:val="28"/>
+          <w:szCs w:val="28"/>
+        </w:rPr>
+      </w:pPr>
+      <w:r>
+        <w:rPr>
+          <w:sz w:val="28"/>
+          <w:szCs w:val="28"/>
+        </w:rPr>
+        <w:t>For example:</w:t>
+      </w:r>
+    </w:p>
+    <w:p>
+      <w:pPr>
+        <w:rPr>
+          <w:sz w:val="28"/>
+          <w:szCs w:val="28"/>
+        </w:rPr>
+      </w:pPr>
+      <w:r>
+        <w:rPr>
+          <w:sz w:val="28"/>
+          <w:szCs w:val="28"/>
+        </w:rPr>
+        <w:t>Minimum = 10 sec</w:t>
+      </w:r>
+    </w:p>
+    <w:p>
+      <w:pPr>
+        <w:rPr>
+          <w:sz w:val="28"/>
+          <w:szCs w:val="28"/>
+        </w:rPr>
+      </w:pPr>
+      <w:r>
+        <w:rPr>
+          <w:sz w:val="28"/>
+          <w:szCs w:val="28"/>
+        </w:rPr>
+        <w:t>Maximum = 50 sec</w:t>
+      </w:r>
+    </w:p>
+    <w:p>
+      <w:pPr>
+        <w:rPr>
+          <w:sz w:val="28"/>
+          <w:szCs w:val="28"/>
+        </w:rPr>
+      </w:pPr>
+      <w:r>
+        <w:rPr>
+          <w:sz w:val="28"/>
+          <w:szCs w:val="28"/>
+        </w:rPr>
+        <w:t>The exact values can be adjusted during testing.</w:t>
+      </w:r>
+    </w:p>
+    <w:p>
+      <w:pPr>
+        <w:rPr>
+          <w:sz w:val="28"/>
+          <w:szCs w:val="28"/>
+        </w:rPr>
+      </w:pPr>
+      <w:r>
+        <w:rPr>
+          <w:sz w:val="28"/>
+          <w:szCs w:val="28"/>
+        </w:rPr>
+        <w:t>This prevents extremely short or excessively long green phases.</w:t>
+      </w:r>
+    </w:p>
+    <w:p>
+      <w:pPr>
+        <w:rPr>
+          <w:sz w:val="28"/>
+          <w:szCs w:val="28"/>
+        </w:rPr>
+      </w:pPr>
+      <w:r>
+        <w:rPr>
+          <w:sz w:val="28"/>
+          <w:szCs w:val="28"/>
+        </w:rPr>
+        <w:pict w14:anchorId="336589DF">
+          <v:rect id="_x0000_i1033" style="width:0;height:1.5pt" o:hralign="center" o:hrstd="t" o:hr="t" fillcolor="#a0a0a0" stroked="f"/>
+        </w:pict>
+      </w:r>
+    </w:p>
+    <w:p>
+      <w:pPr>
         <w:rPr>
           <w:b/>
           <w:bCs/>
           <w:sz w:val="28"/>
           <w:szCs w:val="28"/>
         </w:rPr>
-        <w:t>Assumption 9 – Yellow Phase</w:t>
-      </w:r>
-    </w:p>
-    <w:p>
-      <w:pPr>
-        <w:rPr>
-          <w:sz w:val="28"/>
-          <w:szCs w:val="28"/>
-        </w:rPr>
-      </w:pPr>
-      <w:r>
-        <w:rPr>
-          <w:sz w:val="28"/>
-          <w:szCs w:val="28"/>
-        </w:rPr>
-        <w:t>Whenever the green lane changes, it first goes through:</w:t>
-      </w:r>
-    </w:p>
-    <w:p>
-      <w:pPr>
-        <w:rPr>
-          <w:sz w:val="28"/>
-          <w:szCs w:val="28"/>
-        </w:rPr>
-      </w:pPr>
-      <w:r>
-        <w:rPr>
-          <w:sz w:val="28"/>
-          <w:szCs w:val="28"/>
-        </w:rPr>
-        <w:t>GREEN → YELLOW</w:t>
-      </w:r>
-    </w:p>
-    <w:p>
-      <w:pPr>
-        <w:rPr>
-          <w:sz w:val="28"/>
-          <w:szCs w:val="28"/>
-        </w:rPr>
-      </w:pPr>
-      <w:r>
-        <w:rPr>
-          <w:sz w:val="28"/>
-          <w:szCs w:val="28"/>
-        </w:rPr>
-        <w:t>This provides a safe transition.</w:t>
-      </w:r>
-    </w:p>
-    <w:p>
-      <w:pPr>
-        <w:rPr>
-          <w:sz w:val="28"/>
-          <w:szCs w:val="28"/>
-        </w:rPr>
-      </w:pPr>
-      <w:r>
-        <w:rPr>
-          <w:sz w:val="28"/>
-          <w:szCs w:val="28"/>
-        </w:rPr>
-        <w:pict w14:anchorId="59670D72">
-          <v:rect id="_x0000_i1220" style="width:0;height:1.5pt" o:hralign="center" o:hrstd="t" o:hr="t" fillcolor="#a0a0a0" stroked="f"/>
-        </w:pict>
-      </w:r>
-    </w:p>
-    <w:p>
-      <w:pPr>
+      </w:pPr>
+      <w:r>
         <w:rPr>
           <w:b/>
           <w:bCs/>
           <w:sz w:val="28"/>
           <w:szCs w:val="28"/>
         </w:rPr>
-      </w:pPr>
+        <w:t>Assumption 9 – Yellow Phase</w:t>
+      </w:r>
+    </w:p>
+    <w:p>
+      <w:pPr>
+        <w:rPr>
+          <w:sz w:val="28"/>
+          <w:szCs w:val="28"/>
+        </w:rPr>
+      </w:pPr>
+      <w:r>
+        <w:rPr>
+          <w:sz w:val="28"/>
+          <w:szCs w:val="28"/>
+        </w:rPr>
+        <w:t>Whenever the green lane changes, it first goes through:</w:t>
+      </w:r>
+    </w:p>
+    <w:p>
+      <w:pPr>
+        <w:rPr>
+          <w:sz w:val="28"/>
+          <w:szCs w:val="28"/>
+        </w:rPr>
+      </w:pPr>
+      <w:r>
+        <w:rPr>
+          <w:sz w:val="28"/>
+          <w:szCs w:val="28"/>
+        </w:rPr>
+        <w:t>GREEN → YELLOW</w:t>
+      </w:r>
+    </w:p>
+    <w:p>
+      <w:pPr>
+        <w:rPr>
+          <w:sz w:val="28"/>
+          <w:szCs w:val="28"/>
+        </w:rPr>
+      </w:pPr>
+      <w:r>
+        <w:rPr>
+          <w:sz w:val="28"/>
+          <w:szCs w:val="28"/>
+        </w:rPr>
+        <w:t>This provides a safe transition.</w:t>
+      </w:r>
+    </w:p>
+    <w:p>
+      <w:pPr>
+        <w:rPr>
+          <w:sz w:val="28"/>
+          <w:szCs w:val="28"/>
+        </w:rPr>
+      </w:pPr>
+      <w:r>
+        <w:rPr>
+          <w:sz w:val="28"/>
+          <w:szCs w:val="28"/>
+        </w:rPr>
+        <w:pict w14:anchorId="59670D72">
+          <v:rect id="_x0000_i1034" style="width:0;height:1.5pt" o:hralign="center" o:hrstd="t" o:hr="t" fillcolor="#a0a0a0" stroked="f"/>
+        </w:pict>
+      </w:r>
     </w:p>
     <w:p>
       <w:pPr>
@@ -1803,13 +1822,23 @@
           <w:szCs w:val="28"/>
         </w:rPr>
       </w:pPr>
-      <w:r>
+    </w:p>
+    <w:p>
+      <w:pPr>
         <w:rPr>
           <w:b/>
           <w:bCs/>
           <w:sz w:val="28"/>
           <w:szCs w:val="28"/>
         </w:rPr>
+      </w:pPr>
+      <w:r>
+        <w:rPr>
+          <w:b/>
+          <w:bCs/>
+          <w:sz w:val="28"/>
+          <w:szCs w:val="28"/>
+        </w:rPr>
         <w:lastRenderedPageBreak/>
         <w:t>Assumption 10 – All-Red Clearance</w:t>
       </w:r>
@@ -1887,7 +1916,7 @@
           <w:szCs w:val="28"/>
         </w:rPr>
         <w:pict w14:anchorId="617BBBA8">
-          <v:rect id="_x0000_i1221" style="width:0;height:1.5pt" o:hralign="center" o:hrstd="t" o:hr="t" fillcolor="#a0a0a0" stroked="f"/>
+          <v:rect id="_x0000_i1035" style="width:0;height:1.5pt" o:hralign="center" o:hrstd="t" o:hr="t" fillcolor="#a0a0a0" stroked="f"/>
         </w:pict>
       </w:r>
     </w:p>
@@ -1958,12 +1987,14 @@
     <w:p>
       <w:pPr>
         <w:rPr>
-          <w:sz w:val="28"/>
-          <w:szCs w:val="28"/>
-        </w:rPr>
-      </w:pPr>
-      <w:r>
-        <w:rPr>
+          <w:color w:val="EE0000"/>
+          <w:sz w:val="28"/>
+          <w:szCs w:val="28"/>
+        </w:rPr>
+      </w:pPr>
+      <w:r>
+        <w:rPr>
+          <w:color w:val="EE0000"/>
           <w:sz w:val="28"/>
           <w:szCs w:val="28"/>
         </w:rPr>
@@ -1973,12 +2004,14 @@
     <w:p>
       <w:pPr>
         <w:rPr>
-          <w:sz w:val="28"/>
-          <w:szCs w:val="28"/>
-        </w:rPr>
-      </w:pPr>
-      <w:r>
-        <w:rPr>
+          <w:color w:val="EE0000"/>
+          <w:sz w:val="28"/>
+          <w:szCs w:val="28"/>
+        </w:rPr>
+      </w:pPr>
+      <w:r>
+        <w:rPr>
+          <w:color w:val="EE0000"/>
           <w:sz w:val="28"/>
           <w:szCs w:val="28"/>
         </w:rPr>
@@ -2043,7 +2076,7 @@
           <w:szCs w:val="28"/>
         </w:rPr>
         <w:pict w14:anchorId="62DB15CA">
-          <v:rect id="_x0000_i1222" style="width:0;height:1.5pt" o:hralign="center" o:hrstd="t" o:hr="t" fillcolor="#a0a0a0" stroked="f"/>
+          <v:rect id="_x0000_i1036" style="width:0;height:1.5pt" o:hralign="center" o:hrstd="t" o:hr="t" fillcolor="#a0a0a0" stroked="f"/>
         </w:pict>
       </w:r>
     </w:p>
@@ -2214,7 +2247,7 @@
           <w:szCs w:val="28"/>
         </w:rPr>
         <w:pict w14:anchorId="09DFC698">
-          <v:rect id="_x0000_i1223" style="width:0;height:1.5pt" o:hralign="center" o:hrstd="t" o:hr="t" fillcolor="#a0a0a0" stroked="f"/>
+          <v:rect id="_x0000_i1037" style="width:0;height:1.5pt" o:hralign="center" o:hrstd="t" o:hr="t" fillcolor="#a0a0a0" stroked="f"/>
         </w:pict>
       </w:r>
     </w:p>
@@ -2524,7 +2557,7 @@
           <w:szCs w:val="28"/>
         </w:rPr>
         <w:pict w14:anchorId="68D27162">
-          <v:rect id="_x0000_i1224" style="width:0;height:1.5pt" o:hralign="center" o:hrstd="t" o:hr="t" fillcolor="#a0a0a0" stroked="f"/>
+          <v:rect id="_x0000_i1038" style="width:0;height:1.5pt" o:hralign="center" o:hrstd="t" o:hr="t" fillcolor="#a0a0a0" stroked="f"/>
         </w:pict>
       </w:r>
     </w:p>
@@ -2778,7 +2811,7 @@
           <w:szCs w:val="28"/>
         </w:rPr>
         <w:pict w14:anchorId="6C54B755">
-          <v:rect id="_x0000_i1225" style="width:0;height:1.5pt" o:hralign="center" o:hrstd="t" o:hr="t" fillcolor="#a0a0a0" stroked="f"/>
+          <v:rect id="_x0000_i1039" style="width:0;height:1.5pt" o:hralign="center" o:hrstd="t" o:hr="t" fillcolor="#a0a0a0" stroked="f"/>
         </w:pict>
       </w:r>
     </w:p>
@@ -2937,7 +2970,7 @@
           <w:szCs w:val="28"/>
         </w:rPr>
         <w:pict w14:anchorId="090A25F4">
-          <v:rect id="_x0000_i1226" style="width:0;height:1.5pt" o:hralign="center" o:hrstd="t" o:hr="t" fillcolor="#a0a0a0" stroked="f"/>
+          <v:rect id="_x0000_i1040" style="width:0;height:1.5pt" o:hralign="center" o:hrstd="t" o:hr="t" fillcolor="#a0a0a0" stroked="f"/>
         </w:pict>
       </w:r>
     </w:p>
@@ -3078,7 +3111,7 @@
           <w:szCs w:val="28"/>
         </w:rPr>
         <w:pict w14:anchorId="655EAEAC">
-          <v:rect id="_x0000_i1227" style="width:0;height:1.5pt" o:hralign="center" o:hrstd="t" o:hr="t" fillcolor="#a0a0a0" stroked="f"/>
+          <v:rect id="_x0000_i1041" style="width:0;height:1.5pt" o:hralign="center" o:hrstd="t" o:hr="t" fillcolor="#a0a0a0" stroked="f"/>
         </w:pict>
       </w:r>
     </w:p>
@@ -3281,7 +3314,7 @@
           <w:szCs w:val="28"/>
         </w:rPr>
         <w:pict w14:anchorId="7C5FDCB0">
-          <v:rect id="_x0000_i1228" style="width:0;height:1.5pt" o:hralign="center" o:hrstd="t" o:hr="t" fillcolor="#a0a0a0" stroked="f"/>
+          <v:rect id="_x0000_i1042" style="width:0;height:1.5pt" o:hralign="center" o:hrstd="t" o:hr="t" fillcolor="#a0a0a0" stroked="f"/>
         </w:pict>
       </w:r>
     </w:p>
@@ -3593,7 +3626,7 @@
           <w:szCs w:val="28"/>
         </w:rPr>
         <w:pict w14:anchorId="04A254D6">
-          <v:rect id="_x0000_i1229" style="width:0;height:1.5pt" o:hralign="center" o:hrstd="t" o:hr="t" fillcolor="#a0a0a0" stroked="f"/>
+          <v:rect id="_x0000_i1043" style="width:0;height:1.5pt" o:hralign="center" o:hrstd="t" o:hr="t" fillcolor="#a0a0a0" stroked="f"/>
         </w:pict>
       </w:r>
     </w:p>
@@ -3811,7 +3844,7 @@
           <w:szCs w:val="28"/>
         </w:rPr>
         <w:pict w14:anchorId="629D43D2">
-          <v:rect id="_x0000_i1230" style="width:0;height:1.5pt" o:hralign="center" o:hrstd="t" o:hr="t" fillcolor="#a0a0a0" stroked="f"/>
+          <v:rect id="_x0000_i1044" style="width:0;height:1.5pt" o:hralign="center" o:hrstd="t" o:hr="t" fillcolor="#a0a0a0" stroked="f"/>
         </w:pict>
       </w:r>
     </w:p>
@@ -3979,7 +4012,7 @@
           <w:szCs w:val="28"/>
         </w:rPr>
         <w:pict w14:anchorId="463FC454">
-          <v:rect id="_x0000_i1231" style="width:0;height:1.5pt" o:hralign="center" o:hrstd="t" o:hr="t" fillcolor="#a0a0a0" stroked="f"/>
+          <v:rect id="_x0000_i1045" style="width:0;height:1.5pt" o:hralign="center" o:hrstd="t" o:hr="t" fillcolor="#a0a0a0" stroked="f"/>
         </w:pict>
       </w:r>
     </w:p>
@@ -4096,7 +4129,7 @@
           <w:szCs w:val="28"/>
         </w:rPr>
         <w:pict w14:anchorId="175B99B8">
-          <v:rect id="_x0000_i1232" style="width:0;height:1.5pt" o:hralign="center" o:hrstd="t" o:hr="t" fillcolor="#a0a0a0" stroked="f"/>
+          <v:rect id="_x0000_i1046" style="width:0;height:1.5pt" o:hralign="center" o:hrstd="t" o:hr="t" fillcolor="#a0a0a0" stroked="f"/>
         </w:pict>
       </w:r>
     </w:p>
@@ -4433,7 +4466,7 @@
           <w:szCs w:val="28"/>
         </w:rPr>
         <w:pict w14:anchorId="3024DB19">
-          <v:rect id="_x0000_i1233" style="width:0;height:1.5pt" o:hralign="center" o:hrstd="t" o:hr="t" fillcolor="#a0a0a0" stroked="f"/>
+          <v:rect id="_x0000_i1047" style="width:0;height:1.5pt" o:hralign="center" o:hrstd="t" o:hr="t" fillcolor="#a0a0a0" stroked="f"/>
         </w:pict>
       </w:r>
     </w:p>
@@ -5013,7 +5046,7 @@
           <w:szCs w:val="28"/>
         </w:rPr>
         <w:pict w14:anchorId="10F60ADA">
-          <v:rect id="_x0000_i1234" style="width:0;height:1.5pt" o:hralign="center" o:hrstd="t" o:hr="t" fillcolor="#a0a0a0" stroked="f"/>
+          <v:rect id="_x0000_i1048" style="width:0;height:1.5pt" o:hralign="center" o:hrstd="t" o:hr="t" fillcolor="#a0a0a0" stroked="f"/>
         </w:pict>
       </w:r>
     </w:p>
@@ -5274,7 +5307,7 @@
           <w:szCs w:val="28"/>
         </w:rPr>
         <w:pict w14:anchorId="4A0B0C96">
-          <v:rect id="_x0000_i1235" style="width:0;height:1.5pt" o:hralign="center" o:hrstd="t" o:hr="t" fillcolor="#a0a0a0" stroked="f"/>
+          <v:rect id="_x0000_i1049" style="width:0;height:1.5pt" o:hralign="center" o:hrstd="t" o:hr="t" fillcolor="#a0a0a0" stroked="f"/>
         </w:pict>
       </w:r>
     </w:p>
@@ -5582,7 +5615,7 @@
           <w:szCs w:val="28"/>
         </w:rPr>
         <w:pict w14:anchorId="24EEA398">
-          <v:rect id="_x0000_i1236" style="width:0;height:1.5pt" o:hralign="center" o:hrstd="t" o:hr="t" fillcolor="#a0a0a0" stroked="f"/>
+          <v:rect id="_x0000_i1050" style="width:0;height:1.5pt" o:hralign="center" o:hrstd="t" o:hr="t" fillcolor="#a0a0a0" stroked="f"/>
         </w:pict>
       </w:r>
     </w:p>
@@ -5904,7 +5937,7 @@
           <w:szCs w:val="28"/>
         </w:rPr>
         <w:pict w14:anchorId="7206D489">
-          <v:rect id="_x0000_i1237" style="width:0;height:1.5pt" o:hralign="center" o:hrstd="t" o:hr="t" fillcolor="#a0a0a0" stroked="f"/>
+          <v:rect id="_x0000_i1051" style="width:0;height:1.5pt" o:hralign="center" o:hrstd="t" o:hr="t" fillcolor="#a0a0a0" stroked="f"/>
         </w:pict>
       </w:r>
     </w:p>
@@ -6075,7 +6108,7 @@
           <w:szCs w:val="28"/>
         </w:rPr>
         <w:pict w14:anchorId="0B146F34">
-          <v:rect id="_x0000_i1238" style="width:0;height:1.5pt" o:hralign="center" o:hrstd="t" o:hr="t" fillcolor="#a0a0a0" stroked="f"/>
+          <v:rect id="_x0000_i1052" style="width:0;height:1.5pt" o:hralign="center" o:hrstd="t" o:hr="t" fillcolor="#a0a0a0" stroked="f"/>
         </w:pict>
       </w:r>
     </w:p>
@@ -6645,27 +6678,38 @@
     <w:p>
       <w:pPr>
         <w:rPr>
-          <w:sz w:val="28"/>
-          <w:szCs w:val="28"/>
-        </w:rPr>
-      </w:pPr>
-      <w:r>
-        <w:rPr>
-          <w:sz w:val="28"/>
-          <w:szCs w:val="28"/>
-        </w:rPr>
-        <w:t>11. Calculate queue length.</w:t>
-      </w:r>
-    </w:p>
-    <w:p>
-      <w:pPr>
-        <w:rPr>
-          <w:sz w:val="28"/>
-          <w:szCs w:val="28"/>
-        </w:rPr>
-      </w:pPr>
-      <w:r>
-        <w:rPr>
+          <w:color w:val="EE0000"/>
+          <w:sz w:val="28"/>
+          <w:szCs w:val="28"/>
+        </w:rPr>
+      </w:pPr>
+      <w:r>
+        <w:rPr>
+          <w:sz w:val="28"/>
+          <w:szCs w:val="28"/>
+        </w:rPr>
+        <w:t xml:space="preserve">11. </w:t>
+      </w:r>
+      <w:r>
+        <w:rPr>
+          <w:color w:val="EE0000"/>
+          <w:sz w:val="28"/>
+          <w:szCs w:val="28"/>
+        </w:rPr>
+        <w:t>Calculate queue length.</w:t>
+      </w:r>
+    </w:p>
+    <w:p>
+      <w:pPr>
+        <w:rPr>
+          <w:color w:val="EE0000"/>
+          <w:sz w:val="28"/>
+          <w:szCs w:val="28"/>
+        </w:rPr>
+      </w:pPr>
+      <w:r>
+        <w:rPr>
+          <w:color w:val="EE0000"/>
           <w:sz w:val="28"/>
           <w:szCs w:val="28"/>
         </w:rPr>
@@ -6753,7 +6797,22 @@
           <w:szCs w:val="28"/>
         </w:rPr>
         <w:lastRenderedPageBreak/>
-        <w:t>16. Determine their lane and distance/ETA.</w:t>
+        <w:t xml:space="preserve">16. </w:t>
+      </w:r>
+      <w:r>
+        <w:rPr>
+          <w:color w:val="EE0000"/>
+          <w:sz w:val="28"/>
+          <w:szCs w:val="28"/>
+        </w:rPr>
+        <w:t>Determine their lane and distance/ETA</w:t>
+      </w:r>
+      <w:r>
+        <w:rPr>
+          <w:sz w:val="28"/>
+          <w:szCs w:val="28"/>
+        </w:rPr>
+        <w:t>.</w:t>
       </w:r>
     </w:p>
     <w:p>
@@ -6931,16 +6990,25 @@
     <w:p>
       <w:pPr>
         <w:rPr>
-          <w:sz w:val="28"/>
-          <w:szCs w:val="28"/>
-        </w:rPr>
-      </w:pPr>
-      <w:r>
-        <w:rPr>
-          <w:sz w:val="28"/>
-          <w:szCs w:val="28"/>
-        </w:rPr>
-        <w:t>19. ELSE IF emergency vehicle is in a RED LANE:</w:t>
+          <w:color w:val="EE0000"/>
+          <w:sz w:val="28"/>
+          <w:szCs w:val="28"/>
+        </w:rPr>
+      </w:pPr>
+      <w:r>
+        <w:rPr>
+          <w:sz w:val="28"/>
+          <w:szCs w:val="28"/>
+        </w:rPr>
+        <w:t xml:space="preserve">19. </w:t>
+      </w:r>
+      <w:r>
+        <w:rPr>
+          <w:color w:val="EE0000"/>
+          <w:sz w:val="28"/>
+          <w:szCs w:val="28"/>
+        </w:rPr>
+        <w:t>ELSE IF emergency vehicle is in a RED LANE:</w:t>
       </w:r>
     </w:p>
     <w:p>
@@ -7263,37 +7331,33 @@
           <w:sz w:val="28"/>
           <w:szCs w:val="28"/>
         </w:rPr>
-        <w:t xml:space="preserve"> Queue </w:t>
+        <w:t xml:space="preserve"> </w:t>
+      </w:r>
+      <w:r>
+        <w:rPr>
+          <w:color w:val="EE0000"/>
+          <w:sz w:val="28"/>
+          <w:szCs w:val="28"/>
+        </w:rPr>
+        <w:t xml:space="preserve">Queue </w:t>
       </w:r>
       <w:proofErr w:type="gramStart"/>
       <w:r>
         <w:rPr>
-          <w:sz w:val="28"/>
-          <w:szCs w:val="28"/>
-        </w:rPr>
-        <w:t>Length</w:t>
-      </w:r>
-      <w:r>
-        <w:rPr>
-          <w:sz w:val="28"/>
-          <w:szCs w:val="28"/>
-        </w:rPr>
-        <w:t xml:space="preserve"> ,</w:t>
+          <w:color w:val="EE0000"/>
+          <w:sz w:val="28"/>
+          <w:szCs w:val="28"/>
+        </w:rPr>
+        <w:t>Length ,</w:t>
       </w:r>
       <w:proofErr w:type="gramEnd"/>
       <w:r>
         <w:rPr>
-          <w:sz w:val="28"/>
-          <w:szCs w:val="28"/>
-        </w:rPr>
-        <w:t xml:space="preserve"> </w:t>
-      </w:r>
-      <w:r>
-        <w:rPr>
-          <w:sz w:val="28"/>
-          <w:szCs w:val="28"/>
-        </w:rPr>
-        <w:t>Waiting Time</w:t>
+          <w:color w:val="EE0000"/>
+          <w:sz w:val="28"/>
+          <w:szCs w:val="28"/>
+        </w:rPr>
+        <w:t xml:space="preserve"> Waiting Time</w:t>
       </w:r>
     </w:p>
     <w:p>
@@ -7570,27 +7634,38 @@
     <w:p>
       <w:pPr>
         <w:rPr>
-          <w:sz w:val="28"/>
-          <w:szCs w:val="28"/>
-        </w:rPr>
-      </w:pPr>
-      <w:r>
-        <w:rPr>
-          <w:sz w:val="28"/>
-          <w:szCs w:val="28"/>
-        </w:rPr>
-        <w:t>37. At the decision point:</w:t>
-      </w:r>
-    </w:p>
-    <w:p>
-      <w:pPr>
-        <w:rPr>
-          <w:sz w:val="28"/>
-          <w:szCs w:val="28"/>
-        </w:rPr>
-      </w:pPr>
-      <w:r>
-        <w:rPr>
+          <w:color w:val="EE0000"/>
+          <w:sz w:val="28"/>
+          <w:szCs w:val="28"/>
+        </w:rPr>
+      </w:pPr>
+      <w:r>
+        <w:rPr>
+          <w:sz w:val="28"/>
+          <w:szCs w:val="28"/>
+        </w:rPr>
+        <w:t xml:space="preserve">37. </w:t>
+      </w:r>
+      <w:r>
+        <w:rPr>
+          <w:color w:val="EE0000"/>
+          <w:sz w:val="28"/>
+          <w:szCs w:val="28"/>
+        </w:rPr>
+        <w:t>At the decision point:</w:t>
+      </w:r>
+    </w:p>
+    <w:p>
+      <w:pPr>
+        <w:rPr>
+          <w:color w:val="EE0000"/>
+          <w:sz w:val="28"/>
+          <w:szCs w:val="28"/>
+        </w:rPr>
+      </w:pPr>
+      <w:r>
+        <w:rPr>
+          <w:color w:val="EE0000"/>
           <w:sz w:val="28"/>
           <w:szCs w:val="28"/>
         </w:rPr>
@@ -7715,7 +7790,7 @@
           <w:szCs w:val="28"/>
         </w:rPr>
         <w:pict w14:anchorId="29FAD2DE">
-          <v:rect id="_x0000_i1239" style="width:0;height:1.5pt" o:hralign="center" o:hrstd="t" o:hr="t" fillcolor="#a0a0a0" stroked="f"/>
+          <v:rect id="_x0000_i1053" style="width:0;height:1.5pt" o:hralign="center" o:hrstd="t" o:hr="t" fillcolor="#a0a0a0" stroked="f"/>
         </w:pict>
       </w:r>
     </w:p>
@@ -7918,10 +7993,18 @@
       </w:pPr>
       <w:r>
         <w:rPr>
+          <w:color w:val="EE0000"/>
           <w:sz w:val="24"/>
           <w:szCs w:val="24"/>
         </w:rPr>
-        <w:t>Distance / ETA       Traffic Demand</w:t>
+        <w:t>Distance / ETA</w:t>
+      </w:r>
+      <w:r>
+        <w:rPr>
+          <w:sz w:val="24"/>
+          <w:szCs w:val="24"/>
+        </w:rPr>
+        <w:t xml:space="preserve">       Traffic Demand</w:t>
       </w:r>
     </w:p>
     <w:p>
@@ -9142,7 +9225,7 @@
           <w:szCs w:val="28"/>
         </w:rPr>
         <w:pict w14:anchorId="20F79B7E">
-          <v:rect id="_x0000_i1241" style="width:0;height:1.5pt" o:hralign="center" o:hrstd="t" o:hr="t" fillcolor="#a0a0a0" stroked="f"/>
+          <v:rect id="_x0000_i1054" style="width:0;height:1.5pt" o:hralign="center" o:hrstd="t" o:hr="t" fillcolor="#a0a0a0" stroked="f"/>
         </w:pict>
       </w:r>
     </w:p>
@@ -10640,6 +10723,7 @@
   <w:style w:type="character" w:default="1" w:styleId="DefaultParagraphFont">
     <w:name w:val="Default Paragraph Font"/>
     <w:uiPriority w:val="1"/>
+    <w:semiHidden/>
     <w:unhideWhenUsed/>
   </w:style>
   <w:style w:type="table" w:default="1" w:styleId="TableNormal">

</xml_diff>

<commit_message>
modified:   Isolation/Editfile.netcfg.xml 	modified:   Isolation/Editfile.rou.xml 	modified:   Isolation/Networkcode.net.xml 	modified:   Isolation/Visuals.sumocfg 	new file:   Isolation/gui_settings.xml 	modified:   Isolation/main.py 	new file:   Isolation/sounds/horn_bike.wav 	new file:   Isolation/sounds/horn_bus.wav 	new file:   Isolation/sounds/horn_car.wav 	new file:   Isolation/sounds/horn_truck.wav 	new file:   Isolation/sounds/siren.wav 	new file:   Isolation/sounds/siren_fire.wav 	new file:   Isolation/sounds/traffic_hum.wav 	new file:   Isolation/without logic.py 	modified:   PPT's/algorithm.docx 	new file:   Random vehicale.txt
</commit_message>
<xml_diff>
--- a/PPT's/algorithm.docx
+++ b/PPT's/algorithm.docx
@@ -141,11 +141,10 @@
       </w:pPr>
       <w:r>
         <w:rPr>
-          <w:color w:val="EE0000"/>
-          <w:sz w:val="28"/>
-          <w:szCs w:val="28"/>
-        </w:rPr>
-        <w:t xml:space="preserve">Considering queue length and waiting time. </w:t>
+          <w:sz w:val="28"/>
+          <w:szCs w:val="28"/>
+        </w:rPr>
+        <w:t xml:space="preserve">Providing priority to ambulances and fire brigades. </w:t>
       </w:r>
     </w:p>
     <w:p>
@@ -164,7 +163,14 @@
           <w:sz w:val="28"/>
           <w:szCs w:val="28"/>
         </w:rPr>
-        <w:t xml:space="preserve">Providing priority to ambulances and fire brigades. </w:t>
+        <w:t xml:space="preserve">Handling multiple emergency vehicles according to their priority. </w:t>
+      </w:r>
+      <w:r>
+        <w:rPr>
+          <w:sz w:val="28"/>
+          <w:szCs w:val="28"/>
+        </w:rPr>
+        <w:t>(max 2 )</w:t>
       </w:r>
     </w:p>
     <w:p>
@@ -183,24 +189,8 @@
           <w:sz w:val="28"/>
           <w:szCs w:val="28"/>
         </w:rPr>
-        <w:t xml:space="preserve">Handling multiple emergency vehicles according to their priority. </w:t>
-      </w:r>
-      <w:r>
-        <w:rPr>
-          <w:sz w:val="28"/>
-          <w:szCs w:val="28"/>
-        </w:rPr>
-        <w:t xml:space="preserve">(max </w:t>
-      </w:r>
-      <w:proofErr w:type="gramStart"/>
-      <w:r>
-        <w:rPr>
-          <w:sz w:val="28"/>
-          <w:szCs w:val="28"/>
-        </w:rPr>
-        <w:t>2 )</w:t>
-      </w:r>
-      <w:proofErr w:type="gramEnd"/>
+        <w:t xml:space="preserve">Maintaining a clockwise/sequential traffic flow. </w:t>
+      </w:r>
     </w:p>
     <w:p>
       <w:pPr>
@@ -218,7 +208,7 @@
           <w:sz w:val="28"/>
           <w:szCs w:val="28"/>
         </w:rPr>
-        <w:t xml:space="preserve">Maintaining a clockwise/sequential traffic flow. </w:t>
+        <w:t xml:space="preserve">Preventing unnecessary fluctuation of the active timer. </w:t>
       </w:r>
     </w:p>
     <w:p>
@@ -237,25 +227,6 @@
           <w:sz w:val="28"/>
           <w:szCs w:val="28"/>
         </w:rPr>
-        <w:t xml:space="preserve">Preventing unnecessary fluctuation of the active timer. </w:t>
-      </w:r>
-    </w:p>
-    <w:p>
-      <w:pPr>
-        <w:numPr>
-          <w:ilvl w:val="0"/>
-          <w:numId w:val="1"/>
-        </w:numPr>
-        <w:rPr>
-          <w:sz w:val="28"/>
-          <w:szCs w:val="28"/>
-        </w:rPr>
-      </w:pPr>
-      <w:r>
-        <w:rPr>
-          <w:sz w:val="28"/>
-          <w:szCs w:val="28"/>
-        </w:rPr>
         <w:t xml:space="preserve">Performing safe switching using yellow and all-red phases. </w:t>
       </w:r>
     </w:p>
@@ -356,90 +327,42 @@
           <w:sz w:val="28"/>
           <w:szCs w:val="28"/>
         </w:rPr>
-        <w:t xml:space="preserve">Lane </w:t>
-      </w:r>
-      <w:proofErr w:type="gramStart"/>
-      <w:r>
-        <w:rPr>
-          <w:sz w:val="28"/>
-          <w:szCs w:val="28"/>
-        </w:rPr>
-        <w:t>1</w:t>
-      </w:r>
-      <w:r>
-        <w:rPr>
-          <w:sz w:val="28"/>
-          <w:szCs w:val="28"/>
-        </w:rPr>
-        <w:t xml:space="preserve"> ,</w:t>
-      </w:r>
-      <w:proofErr w:type="gramEnd"/>
-      <w:r>
-        <w:rPr>
-          <w:sz w:val="28"/>
-          <w:szCs w:val="28"/>
-        </w:rPr>
-        <w:t xml:space="preserve"> </w:t>
-      </w:r>
-      <w:r>
-        <w:rPr>
-          <w:sz w:val="28"/>
-          <w:szCs w:val="28"/>
-        </w:rPr>
-        <w:t xml:space="preserve">Lane </w:t>
-      </w:r>
-      <w:proofErr w:type="gramStart"/>
-      <w:r>
-        <w:rPr>
-          <w:sz w:val="28"/>
-          <w:szCs w:val="28"/>
-        </w:rPr>
-        <w:t>2</w:t>
-      </w:r>
-      <w:r>
-        <w:rPr>
-          <w:sz w:val="28"/>
-          <w:szCs w:val="28"/>
-        </w:rPr>
-        <w:t xml:space="preserve"> ,</w:t>
-      </w:r>
-      <w:proofErr w:type="gramEnd"/>
-      <w:r>
-        <w:rPr>
-          <w:sz w:val="28"/>
-          <w:szCs w:val="28"/>
-        </w:rPr>
-        <w:t xml:space="preserve"> </w:t>
-      </w:r>
-      <w:r>
-        <w:rPr>
-          <w:sz w:val="28"/>
-          <w:szCs w:val="28"/>
-        </w:rPr>
-        <w:t xml:space="preserve">Lane </w:t>
-      </w:r>
-      <w:proofErr w:type="gramStart"/>
-      <w:r>
-        <w:rPr>
-          <w:sz w:val="28"/>
-          <w:szCs w:val="28"/>
-        </w:rPr>
-        <w:t>3</w:t>
-      </w:r>
-      <w:r>
-        <w:rPr>
-          <w:sz w:val="28"/>
-          <w:szCs w:val="28"/>
-        </w:rPr>
-        <w:t xml:space="preserve"> ,</w:t>
-      </w:r>
-      <w:proofErr w:type="gramEnd"/>
-      <w:r>
-        <w:rPr>
-          <w:sz w:val="28"/>
-          <w:szCs w:val="28"/>
-        </w:rPr>
-        <w:t xml:space="preserve"> </w:t>
+        <w:t>Lane 1</w:t>
+      </w:r>
+      <w:r>
+        <w:rPr>
+          <w:sz w:val="28"/>
+          <w:szCs w:val="28"/>
+        </w:rPr>
+        <w:t xml:space="preserve"> , </w:t>
+      </w:r>
+      <w:r>
+        <w:rPr>
+          <w:sz w:val="28"/>
+          <w:szCs w:val="28"/>
+        </w:rPr>
+        <w:t>Lane 2</w:t>
+      </w:r>
+      <w:r>
+        <w:rPr>
+          <w:sz w:val="28"/>
+          <w:szCs w:val="28"/>
+        </w:rPr>
+        <w:t xml:space="preserve"> , </w:t>
+      </w:r>
+      <w:r>
+        <w:rPr>
+          <w:sz w:val="28"/>
+          <w:szCs w:val="28"/>
+        </w:rPr>
+        <w:t>Lane 3</w:t>
+      </w:r>
+      <w:r>
+        <w:rPr>
+          <w:sz w:val="28"/>
+          <w:szCs w:val="28"/>
+        </w:rPr>
+        <w:t xml:space="preserve"> , </w:t>
       </w:r>
       <w:r>
         <w:rPr>
@@ -595,90 +518,42 @@
           <w:sz w:val="28"/>
           <w:szCs w:val="28"/>
         </w:rPr>
-        <w:t xml:space="preserve">Lane 1 → </w:t>
-      </w:r>
-      <w:proofErr w:type="gramStart"/>
-      <w:r>
-        <w:rPr>
-          <w:sz w:val="28"/>
-          <w:szCs w:val="28"/>
-        </w:rPr>
-        <w:t>GREEN</w:t>
-      </w:r>
-      <w:r>
-        <w:rPr>
-          <w:sz w:val="28"/>
-          <w:szCs w:val="28"/>
-        </w:rPr>
-        <w:t xml:space="preserve"> ,</w:t>
-      </w:r>
-      <w:proofErr w:type="gramEnd"/>
-      <w:r>
-        <w:rPr>
-          <w:sz w:val="28"/>
-          <w:szCs w:val="28"/>
-        </w:rPr>
-        <w:t xml:space="preserve"> </w:t>
-      </w:r>
-      <w:r>
-        <w:rPr>
-          <w:sz w:val="28"/>
-          <w:szCs w:val="28"/>
-        </w:rPr>
-        <w:t xml:space="preserve">Lane 2 → </w:t>
-      </w:r>
-      <w:proofErr w:type="gramStart"/>
-      <w:r>
-        <w:rPr>
-          <w:sz w:val="28"/>
-          <w:szCs w:val="28"/>
-        </w:rPr>
-        <w:t>RED</w:t>
-      </w:r>
-      <w:r>
-        <w:rPr>
-          <w:sz w:val="28"/>
-          <w:szCs w:val="28"/>
-        </w:rPr>
-        <w:t xml:space="preserve"> ,</w:t>
-      </w:r>
-      <w:proofErr w:type="gramEnd"/>
-      <w:r>
-        <w:rPr>
-          <w:sz w:val="28"/>
-          <w:szCs w:val="28"/>
-        </w:rPr>
-        <w:t xml:space="preserve"> </w:t>
-      </w:r>
-      <w:r>
-        <w:rPr>
-          <w:sz w:val="28"/>
-          <w:szCs w:val="28"/>
-        </w:rPr>
-        <w:t xml:space="preserve">Lane 3 → </w:t>
-      </w:r>
-      <w:proofErr w:type="gramStart"/>
-      <w:r>
-        <w:rPr>
-          <w:sz w:val="28"/>
-          <w:szCs w:val="28"/>
-        </w:rPr>
-        <w:t>RED</w:t>
-      </w:r>
-      <w:r>
-        <w:rPr>
-          <w:sz w:val="28"/>
-          <w:szCs w:val="28"/>
-        </w:rPr>
-        <w:t xml:space="preserve"> ,</w:t>
-      </w:r>
-      <w:proofErr w:type="gramEnd"/>
-      <w:r>
-        <w:rPr>
-          <w:sz w:val="28"/>
-          <w:szCs w:val="28"/>
-        </w:rPr>
-        <w:t xml:space="preserve"> </w:t>
+        <w:t>Lane 1 → GREEN</w:t>
+      </w:r>
+      <w:r>
+        <w:rPr>
+          <w:sz w:val="28"/>
+          <w:szCs w:val="28"/>
+        </w:rPr>
+        <w:t xml:space="preserve"> , </w:t>
+      </w:r>
+      <w:r>
+        <w:rPr>
+          <w:sz w:val="28"/>
+          <w:szCs w:val="28"/>
+        </w:rPr>
+        <w:t>Lane 2 → RED</w:t>
+      </w:r>
+      <w:r>
+        <w:rPr>
+          <w:sz w:val="28"/>
+          <w:szCs w:val="28"/>
+        </w:rPr>
+        <w:t xml:space="preserve"> , </w:t>
+      </w:r>
+      <w:r>
+        <w:rPr>
+          <w:sz w:val="28"/>
+          <w:szCs w:val="28"/>
+        </w:rPr>
+        <w:t>Lane 3 → RED</w:t>
+      </w:r>
+      <w:r>
+        <w:rPr>
+          <w:sz w:val="28"/>
+          <w:szCs w:val="28"/>
+        </w:rPr>
+        <w:t xml:space="preserve"> , </w:t>
       </w:r>
       <w:r>
         <w:rPr>
@@ -721,22 +596,22 @@
           <w:sz w:val="28"/>
           <w:szCs w:val="28"/>
         </w:rPr>
+        <w:t>Assumption 4 – Defined Detection Area</w:t>
+      </w:r>
+    </w:p>
+    <w:p>
+      <w:pPr>
+        <w:rPr>
+          <w:sz w:val="28"/>
+          <w:szCs w:val="28"/>
+        </w:rPr>
+      </w:pPr>
+      <w:r>
+        <w:rPr>
+          <w:sz w:val="28"/>
+          <w:szCs w:val="28"/>
+        </w:rPr>
         <w:lastRenderedPageBreak/>
-        <w:t>Assumption 4 – Defined Detection Area</w:t>
-      </w:r>
-    </w:p>
-    <w:p>
-      <w:pPr>
-        <w:rPr>
-          <w:sz w:val="28"/>
-          <w:szCs w:val="28"/>
-        </w:rPr>
-      </w:pPr>
-      <w:r>
-        <w:rPr>
-          <w:sz w:val="28"/>
-          <w:szCs w:val="28"/>
-        </w:rPr>
         <w:t xml:space="preserve">A specific </w:t>
       </w:r>
       <w:r>
@@ -953,7 +828,6 @@
           <w:szCs w:val="28"/>
         </w:rPr>
       </w:pPr>
-      <w:proofErr w:type="gramStart"/>
       <w:r>
         <w:rPr>
           <w:sz w:val="28"/>
@@ -966,17 +840,8 @@
           <w:sz w:val="28"/>
           <w:szCs w:val="28"/>
         </w:rPr>
-        <w:t>,</w:t>
-      </w:r>
-      <w:proofErr w:type="gramEnd"/>
-      <w:r>
-        <w:rPr>
-          <w:sz w:val="28"/>
-          <w:szCs w:val="28"/>
-        </w:rPr>
-        <w:t xml:space="preserve"> </w:t>
-      </w:r>
-      <w:proofErr w:type="gramStart"/>
+        <w:t xml:space="preserve">, </w:t>
+      </w:r>
       <w:r>
         <w:rPr>
           <w:sz w:val="28"/>
@@ -989,47 +854,22 @@
           <w:sz w:val="28"/>
           <w:szCs w:val="28"/>
         </w:rPr>
-        <w:t>,</w:t>
-      </w:r>
-      <w:proofErr w:type="gramEnd"/>
-      <w:r>
-        <w:rPr>
-          <w:sz w:val="28"/>
-          <w:szCs w:val="28"/>
-        </w:rPr>
-        <w:t xml:space="preserve"> </w:t>
-      </w:r>
-      <w:r>
-        <w:rPr>
-          <w:sz w:val="28"/>
-          <w:szCs w:val="28"/>
-        </w:rPr>
-        <w:t>Auto-</w:t>
-      </w:r>
-      <w:proofErr w:type="gramStart"/>
-      <w:r>
-        <w:rPr>
-          <w:sz w:val="28"/>
-          <w:szCs w:val="28"/>
-        </w:rPr>
-        <w:t xml:space="preserve">rickshaws </w:t>
-      </w:r>
-      <w:r>
-        <w:rPr>
-          <w:sz w:val="28"/>
-          <w:szCs w:val="28"/>
-        </w:rPr>
-        <w:t>,</w:t>
-      </w:r>
-      <w:proofErr w:type="gramEnd"/>
-      <w:r>
-        <w:rPr>
-          <w:sz w:val="28"/>
-          <w:szCs w:val="28"/>
-        </w:rPr>
-        <w:t xml:space="preserve"> </w:t>
-      </w:r>
-      <w:proofErr w:type="gramStart"/>
+        <w:t xml:space="preserve">, </w:t>
+      </w:r>
+      <w:r>
+        <w:rPr>
+          <w:sz w:val="28"/>
+          <w:szCs w:val="28"/>
+        </w:rPr>
+        <w:t xml:space="preserve">Auto-rickshaws </w:t>
+      </w:r>
+      <w:r>
+        <w:rPr>
+          <w:sz w:val="28"/>
+          <w:szCs w:val="28"/>
+        </w:rPr>
+        <w:t xml:space="preserve">, </w:t>
+      </w:r>
       <w:r>
         <w:rPr>
           <w:sz w:val="28"/>
@@ -1042,17 +882,8 @@
           <w:sz w:val="28"/>
           <w:szCs w:val="28"/>
         </w:rPr>
-        <w:t>,</w:t>
-      </w:r>
-      <w:proofErr w:type="gramEnd"/>
-      <w:r>
-        <w:rPr>
-          <w:sz w:val="28"/>
-          <w:szCs w:val="28"/>
-        </w:rPr>
-        <w:t xml:space="preserve"> </w:t>
-      </w:r>
-      <w:proofErr w:type="gramStart"/>
+        <w:t xml:space="preserve">, </w:t>
+      </w:r>
       <w:r>
         <w:rPr>
           <w:sz w:val="28"/>
@@ -1065,17 +896,8 @@
           <w:sz w:val="28"/>
           <w:szCs w:val="28"/>
         </w:rPr>
-        <w:t>,</w:t>
-      </w:r>
-      <w:proofErr w:type="gramEnd"/>
-      <w:r>
-        <w:rPr>
-          <w:sz w:val="28"/>
-          <w:szCs w:val="28"/>
-        </w:rPr>
-        <w:t xml:space="preserve"> </w:t>
-      </w:r>
-      <w:proofErr w:type="gramStart"/>
+        <w:t xml:space="preserve">, </w:t>
+      </w:r>
       <w:r>
         <w:rPr>
           <w:sz w:val="28"/>
@@ -1088,15 +910,7 @@
           <w:sz w:val="28"/>
           <w:szCs w:val="28"/>
         </w:rPr>
-        <w:t>,</w:t>
-      </w:r>
-      <w:proofErr w:type="gramEnd"/>
-      <w:r>
-        <w:rPr>
-          <w:sz w:val="28"/>
-          <w:szCs w:val="28"/>
-        </w:rPr>
-        <w:t xml:space="preserve"> </w:t>
+        <w:t xml:space="preserve">, </w:t>
       </w:r>
       <w:r>
         <w:rPr>
@@ -1330,22 +1144,22 @@
           <w:sz w:val="28"/>
           <w:szCs w:val="28"/>
         </w:rPr>
+        <w:t>Assumption 7 – Timer Is Locked</w:t>
+      </w:r>
+    </w:p>
+    <w:p>
+      <w:pPr>
+        <w:rPr>
+          <w:sz w:val="28"/>
+          <w:szCs w:val="28"/>
+        </w:rPr>
+      </w:pPr>
+      <w:r>
+        <w:rPr>
+          <w:sz w:val="28"/>
+          <w:szCs w:val="28"/>
+        </w:rPr>
         <w:lastRenderedPageBreak/>
-        <w:t>Assumption 7 – Timer Is Locked</w:t>
-      </w:r>
-    </w:p>
-    <w:p>
-      <w:pPr>
-        <w:rPr>
-          <w:sz w:val="28"/>
-          <w:szCs w:val="28"/>
-        </w:rPr>
-      </w:pPr>
-      <w:r>
-        <w:rPr>
-          <w:sz w:val="28"/>
-          <w:szCs w:val="28"/>
-        </w:rPr>
         <w:t xml:space="preserve">This is one of your </w:t>
       </w:r>
       <w:r>
@@ -1839,22 +1653,22 @@
           <w:sz w:val="28"/>
           <w:szCs w:val="28"/>
         </w:rPr>
+        <w:t>Assumption 10 – All-Red Clearance</w:t>
+      </w:r>
+    </w:p>
+    <w:p>
+      <w:pPr>
+        <w:rPr>
+          <w:sz w:val="28"/>
+          <w:szCs w:val="28"/>
+        </w:rPr>
+      </w:pPr>
+      <w:r>
+        <w:rPr>
+          <w:sz w:val="28"/>
+          <w:szCs w:val="28"/>
+        </w:rPr>
         <w:lastRenderedPageBreak/>
-        <w:t>Assumption 10 – All-Red Clearance</w:t>
-      </w:r>
-    </w:p>
-    <w:p>
-      <w:pPr>
-        <w:rPr>
-          <w:sz w:val="28"/>
-          <w:szCs w:val="28"/>
-        </w:rPr>
-      </w:pPr>
-      <w:r>
-        <w:rPr>
-          <w:sz w:val="28"/>
-          <w:szCs w:val="28"/>
-        </w:rPr>
         <w:t>After yellow:</w:t>
       </w:r>
     </w:p>
@@ -1987,40 +1801,6 @@
     <w:p>
       <w:pPr>
         <w:rPr>
-          <w:color w:val="EE0000"/>
-          <w:sz w:val="28"/>
-          <w:szCs w:val="28"/>
-        </w:rPr>
-      </w:pPr>
-      <w:r>
-        <w:rPr>
-          <w:color w:val="EE0000"/>
-          <w:sz w:val="28"/>
-          <w:szCs w:val="28"/>
-        </w:rPr>
-        <w:t>Queue Length</w:t>
-      </w:r>
-    </w:p>
-    <w:p>
-      <w:pPr>
-        <w:rPr>
-          <w:color w:val="EE0000"/>
-          <w:sz w:val="28"/>
-          <w:szCs w:val="28"/>
-        </w:rPr>
-      </w:pPr>
-      <w:r>
-        <w:rPr>
-          <w:color w:val="EE0000"/>
-          <w:sz w:val="28"/>
-          <w:szCs w:val="28"/>
-        </w:rPr>
-        <w:t>Waiting Time</w:t>
-      </w:r>
-    </w:p>
-    <w:p>
-      <w:pPr>
-        <w:rPr>
           <w:sz w:val="28"/>
           <w:szCs w:val="28"/>
         </w:rPr>
@@ -2141,90 +1921,42 @@
           <w:sz w:val="28"/>
           <w:szCs w:val="28"/>
         </w:rPr>
-        <w:t xml:space="preserve">Lane 1 = 15 </w:t>
-      </w:r>
-      <w:proofErr w:type="gramStart"/>
-      <w:r>
-        <w:rPr>
-          <w:sz w:val="28"/>
-          <w:szCs w:val="28"/>
-        </w:rPr>
-        <w:t>vehicles</w:t>
-      </w:r>
-      <w:r>
-        <w:rPr>
-          <w:sz w:val="28"/>
-          <w:szCs w:val="28"/>
-        </w:rPr>
-        <w:t xml:space="preserve"> ,</w:t>
-      </w:r>
-      <w:proofErr w:type="gramEnd"/>
-      <w:r>
-        <w:rPr>
-          <w:sz w:val="28"/>
-          <w:szCs w:val="28"/>
-        </w:rPr>
-        <w:t xml:space="preserve"> </w:t>
-      </w:r>
-      <w:r>
-        <w:rPr>
-          <w:sz w:val="28"/>
-          <w:szCs w:val="28"/>
-        </w:rPr>
-        <w:t xml:space="preserve">Lane 2 = 8 </w:t>
-      </w:r>
-      <w:proofErr w:type="gramStart"/>
-      <w:r>
-        <w:rPr>
-          <w:sz w:val="28"/>
-          <w:szCs w:val="28"/>
-        </w:rPr>
-        <w:t>vehicles</w:t>
-      </w:r>
-      <w:r>
-        <w:rPr>
-          <w:sz w:val="28"/>
-          <w:szCs w:val="28"/>
-        </w:rPr>
-        <w:t xml:space="preserve"> ,</w:t>
-      </w:r>
-      <w:proofErr w:type="gramEnd"/>
-      <w:r>
-        <w:rPr>
-          <w:sz w:val="28"/>
-          <w:szCs w:val="28"/>
-        </w:rPr>
-        <w:t xml:space="preserve"> </w:t>
-      </w:r>
-      <w:r>
-        <w:rPr>
-          <w:sz w:val="28"/>
-          <w:szCs w:val="28"/>
-        </w:rPr>
-        <w:t xml:space="preserve">Lane 3 = 22 </w:t>
-      </w:r>
-      <w:proofErr w:type="gramStart"/>
-      <w:r>
-        <w:rPr>
-          <w:sz w:val="28"/>
-          <w:szCs w:val="28"/>
-        </w:rPr>
-        <w:t>vehicles</w:t>
-      </w:r>
-      <w:r>
-        <w:rPr>
-          <w:sz w:val="28"/>
-          <w:szCs w:val="28"/>
-        </w:rPr>
-        <w:t xml:space="preserve"> ,</w:t>
-      </w:r>
-      <w:proofErr w:type="gramEnd"/>
-      <w:r>
-        <w:rPr>
-          <w:sz w:val="28"/>
-          <w:szCs w:val="28"/>
-        </w:rPr>
-        <w:t xml:space="preserve"> </w:t>
+        <w:t>Lane 1 = 15 vehicles</w:t>
+      </w:r>
+      <w:r>
+        <w:rPr>
+          <w:sz w:val="28"/>
+          <w:szCs w:val="28"/>
+        </w:rPr>
+        <w:t xml:space="preserve"> , </w:t>
+      </w:r>
+      <w:r>
+        <w:rPr>
+          <w:sz w:val="28"/>
+          <w:szCs w:val="28"/>
+        </w:rPr>
+        <w:t>Lane 2 = 8 vehicles</w:t>
+      </w:r>
+      <w:r>
+        <w:rPr>
+          <w:sz w:val="28"/>
+          <w:szCs w:val="28"/>
+        </w:rPr>
+        <w:t xml:space="preserve"> , </w:t>
+      </w:r>
+      <w:r>
+        <w:rPr>
+          <w:sz w:val="28"/>
+          <w:szCs w:val="28"/>
+        </w:rPr>
+        <w:t>Lane 3 = 22 vehicles</w:t>
+      </w:r>
+      <w:r>
+        <w:rPr>
+          <w:sz w:val="28"/>
+          <w:szCs w:val="28"/>
+        </w:rPr>
+        <w:t xml:space="preserve"> , </w:t>
       </w:r>
       <w:r>
         <w:rPr>
@@ -2401,77 +2133,68 @@
           <w:sz w:val="28"/>
           <w:szCs w:val="28"/>
         </w:rPr>
+        <w:t xml:space="preserve">Each type is given a </w:t>
+      </w:r>
+      <w:r>
+        <w:rPr>
+          <w:b/>
+          <w:bCs/>
+          <w:sz w:val="28"/>
+          <w:szCs w:val="28"/>
+        </w:rPr>
+        <w:t>clearance weight</w:t>
+      </w:r>
+      <w:r>
+        <w:rPr>
+          <w:sz w:val="28"/>
+          <w:szCs w:val="28"/>
+        </w:rPr>
+        <w:t>.</w:t>
+      </w:r>
+    </w:p>
+    <w:p>
+      <w:pPr>
+        <w:rPr>
+          <w:sz w:val="28"/>
+          <w:szCs w:val="28"/>
+        </w:rPr>
+      </w:pPr>
+      <w:r>
+        <w:rPr>
+          <w:sz w:val="28"/>
+          <w:szCs w:val="28"/>
+        </w:rPr>
+        <w:t>Example:</w:t>
+      </w:r>
+    </w:p>
+    <w:p>
+      <w:pPr>
+        <w:rPr>
+          <w:sz w:val="28"/>
+          <w:szCs w:val="28"/>
+        </w:rPr>
+      </w:pPr>
+      <w:r>
+        <w:rPr>
+          <w:sz w:val="28"/>
+          <w:szCs w:val="28"/>
+        </w:rPr>
+        <w:t>Bike  = 1</w:t>
+      </w:r>
+    </w:p>
+    <w:p>
+      <w:pPr>
+        <w:rPr>
+          <w:sz w:val="28"/>
+          <w:szCs w:val="28"/>
+        </w:rPr>
+      </w:pPr>
+      <w:r>
+        <w:rPr>
+          <w:sz w:val="28"/>
+          <w:szCs w:val="28"/>
+        </w:rPr>
         <w:lastRenderedPageBreak/>
-        <w:t xml:space="preserve">Each type is given a </w:t>
-      </w:r>
-      <w:r>
-        <w:rPr>
-          <w:b/>
-          <w:bCs/>
-          <w:sz w:val="28"/>
-          <w:szCs w:val="28"/>
-        </w:rPr>
-        <w:t>clearance weight</w:t>
-      </w:r>
-      <w:r>
-        <w:rPr>
-          <w:sz w:val="28"/>
-          <w:szCs w:val="28"/>
-        </w:rPr>
-        <w:t>.</w:t>
-      </w:r>
-    </w:p>
-    <w:p>
-      <w:pPr>
-        <w:rPr>
-          <w:sz w:val="28"/>
-          <w:szCs w:val="28"/>
-        </w:rPr>
-      </w:pPr>
-      <w:r>
-        <w:rPr>
-          <w:sz w:val="28"/>
-          <w:szCs w:val="28"/>
-        </w:rPr>
-        <w:t>Example:</w:t>
-      </w:r>
-    </w:p>
-    <w:p>
-      <w:pPr>
-        <w:rPr>
-          <w:sz w:val="28"/>
-          <w:szCs w:val="28"/>
-        </w:rPr>
-      </w:pPr>
-      <w:proofErr w:type="gramStart"/>
-      <w:r>
-        <w:rPr>
-          <w:sz w:val="28"/>
-          <w:szCs w:val="28"/>
-        </w:rPr>
-        <w:t>Bike  =</w:t>
-      </w:r>
-      <w:proofErr w:type="gramEnd"/>
-      <w:r>
-        <w:rPr>
-          <w:sz w:val="28"/>
-          <w:szCs w:val="28"/>
-        </w:rPr>
-        <w:t xml:space="preserve"> 1</w:t>
-      </w:r>
-    </w:p>
-    <w:p>
-      <w:pPr>
-        <w:rPr>
-          <w:sz w:val="28"/>
-          <w:szCs w:val="28"/>
-        </w:rPr>
-      </w:pPr>
-      <w:r>
-        <w:rPr>
-          <w:sz w:val="28"/>
-          <w:szCs w:val="28"/>
-        </w:rPr>
         <w:t>Car   = 2</w:t>
       </w:r>
     </w:p>
@@ -2482,21 +2205,12 @@
           <w:szCs w:val="28"/>
         </w:rPr>
       </w:pPr>
-      <w:proofErr w:type="gramStart"/>
-      <w:r>
-        <w:rPr>
-          <w:sz w:val="28"/>
-          <w:szCs w:val="28"/>
-        </w:rPr>
-        <w:t>Auto  =</w:t>
-      </w:r>
-      <w:proofErr w:type="gramEnd"/>
-      <w:r>
-        <w:rPr>
-          <w:sz w:val="28"/>
-          <w:szCs w:val="28"/>
-        </w:rPr>
-        <w:t xml:space="preserve"> 2</w:t>
+      <w:r>
+        <w:rPr>
+          <w:sz w:val="28"/>
+          <w:szCs w:val="28"/>
+        </w:rPr>
+        <w:t>Auto  = 2</w:t>
       </w:r>
     </w:p>
     <w:p>
@@ -2609,27 +2323,7 @@
           <w:sz w:val="28"/>
           <w:szCs w:val="28"/>
         </w:rPr>
-        <w:t xml:space="preserve">Vehicle Type Demand = </w:t>
-      </w:r>
-      <w:proofErr w:type="gramStart"/>
-      <w:r>
-        <w:rPr>
-          <w:b/>
-          <w:bCs/>
-          <w:sz w:val="28"/>
-          <w:szCs w:val="28"/>
-        </w:rPr>
-        <w:t>Σ(</w:t>
-      </w:r>
-      <w:proofErr w:type="gramEnd"/>
-      <w:r>
-        <w:rPr>
-          <w:b/>
-          <w:bCs/>
-          <w:sz w:val="28"/>
-          <w:szCs w:val="28"/>
-        </w:rPr>
-        <w:t>Number of vehicles × Vehicle Type Weight)</w:t>
+        <w:t>Vehicle Type Demand = Σ(Number of vehicles × Vehicle Type Weight)</w:t>
       </w:r>
     </w:p>
     <w:p>
@@ -2908,52 +2602,52 @@
           <w:sz w:val="28"/>
           <w:szCs w:val="28"/>
         </w:rPr>
+        <w:t>Moving vehicles = 12</w:t>
+      </w:r>
+    </w:p>
+    <w:p>
+      <w:pPr>
+        <w:rPr>
+          <w:sz w:val="28"/>
+          <w:szCs w:val="28"/>
+        </w:rPr>
+      </w:pPr>
+      <w:r>
+        <w:rPr>
+          <w:sz w:val="28"/>
+          <w:szCs w:val="28"/>
+        </w:rPr>
+        <w:t>Waiting vehicles = 8</w:t>
+      </w:r>
+    </w:p>
+    <w:p>
+      <w:pPr>
+        <w:rPr>
+          <w:sz w:val="28"/>
+          <w:szCs w:val="28"/>
+        </w:rPr>
+      </w:pPr>
+      <w:r>
+        <w:rPr>
+          <w:sz w:val="28"/>
+          <w:szCs w:val="28"/>
+        </w:rPr>
+        <w:t>Queue Length = 8</w:t>
+      </w:r>
+    </w:p>
+    <w:p>
+      <w:pPr>
+        <w:rPr>
+          <w:sz w:val="28"/>
+          <w:szCs w:val="28"/>
+        </w:rPr>
+      </w:pPr>
+      <w:r>
+        <w:rPr>
+          <w:sz w:val="28"/>
+          <w:szCs w:val="28"/>
+        </w:rPr>
         <w:lastRenderedPageBreak/>
-        <w:t>Moving vehicles = 12</w:t>
-      </w:r>
-    </w:p>
-    <w:p>
-      <w:pPr>
-        <w:rPr>
-          <w:sz w:val="28"/>
-          <w:szCs w:val="28"/>
-        </w:rPr>
-      </w:pPr>
-      <w:r>
-        <w:rPr>
-          <w:sz w:val="28"/>
-          <w:szCs w:val="28"/>
-        </w:rPr>
-        <w:t>Waiting vehicles = 8</w:t>
-      </w:r>
-    </w:p>
-    <w:p>
-      <w:pPr>
-        <w:rPr>
-          <w:sz w:val="28"/>
-          <w:szCs w:val="28"/>
-        </w:rPr>
-      </w:pPr>
-      <w:r>
-        <w:rPr>
-          <w:sz w:val="28"/>
-          <w:szCs w:val="28"/>
-        </w:rPr>
-        <w:t>Queue Length = 8</w:t>
-      </w:r>
-    </w:p>
-    <w:p>
-      <w:pPr>
-        <w:rPr>
-          <w:sz w:val="28"/>
-          <w:szCs w:val="28"/>
-        </w:rPr>
-      </w:pPr>
-      <w:r>
-        <w:rPr>
-          <w:sz w:val="28"/>
-          <w:szCs w:val="28"/>
-        </w:rPr>
         <w:t>Queue length helps identify lanes where vehicles are actually congested.</w:t>
       </w:r>
     </w:p>
@@ -3161,23 +2855,7 @@
           <w:sz w:val="28"/>
           <w:szCs w:val="28"/>
         </w:rPr>
-        <w:t xml:space="preserve">IF </w:t>
-      </w:r>
-      <w:proofErr w:type="spellStart"/>
-      <w:r>
-        <w:rPr>
-          <w:sz w:val="28"/>
-          <w:szCs w:val="28"/>
-        </w:rPr>
-        <w:t>waiting_time</w:t>
-      </w:r>
-      <w:proofErr w:type="spellEnd"/>
-      <w:r>
-        <w:rPr>
-          <w:sz w:val="28"/>
-          <w:szCs w:val="28"/>
-        </w:rPr>
-        <w:t xml:space="preserve"> &gt; MAX_WAITING_TIME</w:t>
+        <w:t>IF waiting_time &gt; MAX_WAITING_TIME</w:t>
       </w:r>
     </w:p>
     <w:p>
@@ -3494,122 +3172,122 @@
           <w:sz w:val="28"/>
           <w:szCs w:val="28"/>
         </w:rPr>
+        <w:t>A simplified priority calculation can be:</w:t>
+      </w:r>
+    </w:p>
+    <w:p>
+      <w:pPr>
+        <w:rPr>
+          <w:sz w:val="28"/>
+          <w:szCs w:val="28"/>
+        </w:rPr>
+      </w:pPr>
+      <w:r>
+        <w:rPr>
+          <w:sz w:val="28"/>
+          <w:szCs w:val="28"/>
+        </w:rPr>
+        <w:t>Priority Score =</w:t>
+      </w:r>
+      <w:r>
+        <w:rPr>
+          <w:sz w:val="28"/>
+          <w:szCs w:val="28"/>
+        </w:rPr>
+        <w:t xml:space="preserve"> </w:t>
+      </w:r>
+      <w:r>
+        <w:rPr>
+          <w:sz w:val="28"/>
+          <w:szCs w:val="28"/>
+        </w:rPr>
+        <w:t>W1 × Traffic Demand</w:t>
+      </w:r>
+      <w:r>
+        <w:rPr>
+          <w:sz w:val="28"/>
+          <w:szCs w:val="28"/>
+        </w:rPr>
+        <w:t xml:space="preserve"> </w:t>
+      </w:r>
+      <w:r>
+        <w:rPr>
+          <w:sz w:val="28"/>
+          <w:szCs w:val="28"/>
+        </w:rPr>
+        <w:t>+</w:t>
+      </w:r>
+      <w:r>
+        <w:rPr>
+          <w:sz w:val="28"/>
+          <w:szCs w:val="28"/>
+        </w:rPr>
+        <w:t xml:space="preserve"> </w:t>
+      </w:r>
+      <w:r>
+        <w:rPr>
+          <w:sz w:val="28"/>
+          <w:szCs w:val="28"/>
+        </w:rPr>
+        <w:t>W2 × Queue Length</w:t>
+      </w:r>
+      <w:r>
+        <w:rPr>
+          <w:sz w:val="28"/>
+          <w:szCs w:val="28"/>
+        </w:rPr>
+        <w:t xml:space="preserve"> </w:t>
+      </w:r>
+      <w:r>
+        <w:rPr>
+          <w:sz w:val="28"/>
+          <w:szCs w:val="28"/>
+        </w:rPr>
+        <w:t>+</w:t>
+      </w:r>
+      <w:r>
+        <w:rPr>
+          <w:sz w:val="28"/>
+          <w:szCs w:val="28"/>
+        </w:rPr>
+        <w:t xml:space="preserve"> </w:t>
+      </w:r>
+      <w:r>
+        <w:rPr>
+          <w:sz w:val="28"/>
+          <w:szCs w:val="28"/>
+        </w:rPr>
+        <w:t>W3 × Waiting Time</w:t>
+      </w:r>
+    </w:p>
+    <w:p>
+      <w:pPr>
+        <w:rPr>
+          <w:sz w:val="28"/>
+          <w:szCs w:val="28"/>
+        </w:rPr>
+      </w:pPr>
+      <w:r>
+        <w:rPr>
+          <w:sz w:val="28"/>
+          <w:szCs w:val="28"/>
+        </w:rPr>
+        <w:t>where W1, W2, and W3 are experimentally selected weights.</w:t>
+      </w:r>
+    </w:p>
+    <w:p>
+      <w:pPr>
+        <w:rPr>
+          <w:sz w:val="28"/>
+          <w:szCs w:val="28"/>
+        </w:rPr>
+      </w:pPr>
+      <w:r>
+        <w:rPr>
+          <w:sz w:val="28"/>
+          <w:szCs w:val="28"/>
+        </w:rPr>
         <w:lastRenderedPageBreak/>
-        <w:t>A simplified priority calculation can be:</w:t>
-      </w:r>
-    </w:p>
-    <w:p>
-      <w:pPr>
-        <w:rPr>
-          <w:sz w:val="28"/>
-          <w:szCs w:val="28"/>
-        </w:rPr>
-      </w:pPr>
-      <w:r>
-        <w:rPr>
-          <w:sz w:val="28"/>
-          <w:szCs w:val="28"/>
-        </w:rPr>
-        <w:t>Priority Score =</w:t>
-      </w:r>
-      <w:r>
-        <w:rPr>
-          <w:sz w:val="28"/>
-          <w:szCs w:val="28"/>
-        </w:rPr>
-        <w:t xml:space="preserve"> </w:t>
-      </w:r>
-      <w:r>
-        <w:rPr>
-          <w:sz w:val="28"/>
-          <w:szCs w:val="28"/>
-        </w:rPr>
-        <w:t>W1 × Traffic Demand</w:t>
-      </w:r>
-      <w:r>
-        <w:rPr>
-          <w:sz w:val="28"/>
-          <w:szCs w:val="28"/>
-        </w:rPr>
-        <w:t xml:space="preserve"> </w:t>
-      </w:r>
-      <w:r>
-        <w:rPr>
-          <w:sz w:val="28"/>
-          <w:szCs w:val="28"/>
-        </w:rPr>
-        <w:t>+</w:t>
-      </w:r>
-      <w:r>
-        <w:rPr>
-          <w:sz w:val="28"/>
-          <w:szCs w:val="28"/>
-        </w:rPr>
-        <w:t xml:space="preserve"> </w:t>
-      </w:r>
-      <w:r>
-        <w:rPr>
-          <w:sz w:val="28"/>
-          <w:szCs w:val="28"/>
-        </w:rPr>
-        <w:t>W2 × Queue Length</w:t>
-      </w:r>
-      <w:r>
-        <w:rPr>
-          <w:sz w:val="28"/>
-          <w:szCs w:val="28"/>
-        </w:rPr>
-        <w:t xml:space="preserve"> </w:t>
-      </w:r>
-      <w:r>
-        <w:rPr>
-          <w:sz w:val="28"/>
-          <w:szCs w:val="28"/>
-        </w:rPr>
-        <w:t>+</w:t>
-      </w:r>
-      <w:r>
-        <w:rPr>
-          <w:sz w:val="28"/>
-          <w:szCs w:val="28"/>
-        </w:rPr>
-        <w:t xml:space="preserve"> </w:t>
-      </w:r>
-      <w:r>
-        <w:rPr>
-          <w:sz w:val="28"/>
-          <w:szCs w:val="28"/>
-        </w:rPr>
-        <w:t>W3 × Waiting Time</w:t>
-      </w:r>
-    </w:p>
-    <w:p>
-      <w:pPr>
-        <w:rPr>
-          <w:sz w:val="28"/>
-          <w:szCs w:val="28"/>
-        </w:rPr>
-      </w:pPr>
-      <w:r>
-        <w:rPr>
-          <w:sz w:val="28"/>
-          <w:szCs w:val="28"/>
-        </w:rPr>
-        <w:t>where W1, W2, and W3 are experimentally selected weights.</w:t>
-      </w:r>
-    </w:p>
-    <w:p>
-      <w:pPr>
-        <w:rPr>
-          <w:sz w:val="28"/>
-          <w:szCs w:val="28"/>
-        </w:rPr>
-      </w:pPr>
-      <w:r>
-        <w:rPr>
-          <w:sz w:val="28"/>
-          <w:szCs w:val="28"/>
-        </w:rPr>
         <w:t>The final green time is restricted between the minimum and maximum values.</w:t>
       </w:r>
     </w:p>
@@ -4052,52 +3730,52 @@
           <w:sz w:val="28"/>
           <w:szCs w:val="28"/>
         </w:rPr>
+        <w:t>13. Emergency Detection Confirmation</w:t>
+      </w:r>
+    </w:p>
+    <w:p>
+      <w:pPr>
+        <w:rPr>
+          <w:sz w:val="28"/>
+          <w:szCs w:val="28"/>
+        </w:rPr>
+      </w:pPr>
+      <w:r>
+        <w:rPr>
+          <w:sz w:val="28"/>
+          <w:szCs w:val="28"/>
+        </w:rPr>
+        <w:t>AI detection can sometimes temporarily miss an object.</w:t>
+      </w:r>
+    </w:p>
+    <w:p>
+      <w:pPr>
+        <w:rPr>
+          <w:sz w:val="28"/>
+          <w:szCs w:val="28"/>
+        </w:rPr>
+      </w:pPr>
+      <w:r>
+        <w:rPr>
+          <w:sz w:val="28"/>
+          <w:szCs w:val="28"/>
+        </w:rPr>
+        <w:t>Therefore:</w:t>
+      </w:r>
+    </w:p>
+    <w:p>
+      <w:pPr>
+        <w:rPr>
+          <w:sz w:val="28"/>
+          <w:szCs w:val="28"/>
+        </w:rPr>
+      </w:pPr>
+      <w:r>
+        <w:rPr>
+          <w:sz w:val="28"/>
+          <w:szCs w:val="28"/>
+        </w:rPr>
         <w:lastRenderedPageBreak/>
-        <w:t>13. Emergency Detection Confirmation</w:t>
-      </w:r>
-    </w:p>
-    <w:p>
-      <w:pPr>
-        <w:rPr>
-          <w:sz w:val="28"/>
-          <w:szCs w:val="28"/>
-        </w:rPr>
-      </w:pPr>
-      <w:r>
-        <w:rPr>
-          <w:sz w:val="28"/>
-          <w:szCs w:val="28"/>
-        </w:rPr>
-        <w:t>AI detection can sometimes temporarily miss an object.</w:t>
-      </w:r>
-    </w:p>
-    <w:p>
-      <w:pPr>
-        <w:rPr>
-          <w:sz w:val="28"/>
-          <w:szCs w:val="28"/>
-        </w:rPr>
-      </w:pPr>
-      <w:r>
-        <w:rPr>
-          <w:sz w:val="28"/>
-          <w:szCs w:val="28"/>
-        </w:rPr>
-        <w:t>Therefore:</w:t>
-      </w:r>
-    </w:p>
-    <w:p>
-      <w:pPr>
-        <w:rPr>
-          <w:sz w:val="28"/>
-          <w:szCs w:val="28"/>
-        </w:rPr>
-      </w:pPr>
-      <w:r>
-        <w:rPr>
-          <w:sz w:val="28"/>
-          <w:szCs w:val="28"/>
-        </w:rPr>
         <w:t>An emergency vehicle should be confirmed only after it is detected for a predefined number of consecutive frames.</w:t>
       </w:r>
     </w:p>
@@ -4496,52 +4174,52 @@
           <w:sz w:val="28"/>
           <w:szCs w:val="28"/>
         </w:rPr>
+        <w:t>15. Emergency Case 2 – Ambulance in the Current Green Lane</w:t>
+      </w:r>
+    </w:p>
+    <w:p>
+      <w:pPr>
+        <w:rPr>
+          <w:sz w:val="28"/>
+          <w:szCs w:val="28"/>
+        </w:rPr>
+      </w:pPr>
+      <w:r>
+        <w:rPr>
+          <w:sz w:val="28"/>
+          <w:szCs w:val="28"/>
+        </w:rPr>
+        <w:t>This is the special case you discussed.</w:t>
+      </w:r>
+    </w:p>
+    <w:p>
+      <w:pPr>
+        <w:rPr>
+          <w:sz w:val="28"/>
+          <w:szCs w:val="28"/>
+        </w:rPr>
+      </w:pPr>
+      <w:r>
+        <w:rPr>
+          <w:sz w:val="28"/>
+          <w:szCs w:val="28"/>
+        </w:rPr>
+        <w:t>Example:</w:t>
+      </w:r>
+    </w:p>
+    <w:p>
+      <w:pPr>
+        <w:rPr>
+          <w:sz w:val="28"/>
+          <w:szCs w:val="28"/>
+        </w:rPr>
+      </w:pPr>
+      <w:r>
+        <w:rPr>
+          <w:sz w:val="28"/>
+          <w:szCs w:val="28"/>
+        </w:rPr>
         <w:lastRenderedPageBreak/>
-        <w:t>15. Emergency Case 2 – Ambulance in the Current Green Lane</w:t>
-      </w:r>
-    </w:p>
-    <w:p>
-      <w:pPr>
-        <w:rPr>
-          <w:sz w:val="28"/>
-          <w:szCs w:val="28"/>
-        </w:rPr>
-      </w:pPr>
-      <w:r>
-        <w:rPr>
-          <w:sz w:val="28"/>
-          <w:szCs w:val="28"/>
-        </w:rPr>
-        <w:t>This is the special case you discussed.</w:t>
-      </w:r>
-    </w:p>
-    <w:p>
-      <w:pPr>
-        <w:rPr>
-          <w:sz w:val="28"/>
-          <w:szCs w:val="28"/>
-        </w:rPr>
-      </w:pPr>
-      <w:r>
-        <w:rPr>
-          <w:sz w:val="28"/>
-          <w:szCs w:val="28"/>
-        </w:rPr>
-        <w:t>Example:</w:t>
-      </w:r>
-    </w:p>
-    <w:p>
-      <w:pPr>
-        <w:rPr>
-          <w:sz w:val="28"/>
-          <w:szCs w:val="28"/>
-        </w:rPr>
-      </w:pPr>
-      <w:r>
-        <w:rPr>
-          <w:sz w:val="28"/>
-          <w:szCs w:val="28"/>
-        </w:rPr>
         <w:t>Lane 1 → GREEN</w:t>
       </w:r>
     </w:p>
@@ -4941,63 +4619,54 @@
           <w:sz w:val="28"/>
           <w:szCs w:val="28"/>
         </w:rPr>
+        <w:t xml:space="preserve">       ↓</w:t>
+      </w:r>
+    </w:p>
+    <w:p>
+      <w:pPr>
+        <w:rPr>
+          <w:sz w:val="28"/>
+          <w:szCs w:val="28"/>
+        </w:rPr>
+      </w:pPr>
+      <w:r>
+        <w:rPr>
+          <w:sz w:val="28"/>
+          <w:szCs w:val="28"/>
+        </w:rPr>
+        <w:t>Next lane</w:t>
+      </w:r>
+    </w:p>
+    <w:p>
+      <w:pPr>
+        <w:rPr>
+          <w:sz w:val="28"/>
+          <w:szCs w:val="28"/>
+        </w:rPr>
+      </w:pPr>
+      <w:r>
+        <w:rPr>
+          <w:sz w:val="28"/>
+          <w:szCs w:val="28"/>
+        </w:rPr>
+        <w:t>So there are two separate concepts:</w:t>
+      </w:r>
+    </w:p>
+    <w:p>
+      <w:pPr>
+        <w:rPr>
+          <w:sz w:val="28"/>
+          <w:szCs w:val="28"/>
+        </w:rPr>
+      </w:pPr>
+      <w:r>
+        <w:rPr>
+          <w:b/>
+          <w:bCs/>
+          <w:sz w:val="28"/>
+          <w:szCs w:val="28"/>
+        </w:rPr>
         <w:lastRenderedPageBreak/>
-        <w:t xml:space="preserve">       ↓</w:t>
-      </w:r>
-    </w:p>
-    <w:p>
-      <w:pPr>
-        <w:rPr>
-          <w:sz w:val="28"/>
-          <w:szCs w:val="28"/>
-        </w:rPr>
-      </w:pPr>
-      <w:r>
-        <w:rPr>
-          <w:sz w:val="28"/>
-          <w:szCs w:val="28"/>
-        </w:rPr>
-        <w:t>Next lane</w:t>
-      </w:r>
-    </w:p>
-    <w:p>
-      <w:pPr>
-        <w:rPr>
-          <w:sz w:val="28"/>
-          <w:szCs w:val="28"/>
-        </w:rPr>
-      </w:pPr>
-      <w:proofErr w:type="gramStart"/>
-      <w:r>
-        <w:rPr>
-          <w:sz w:val="28"/>
-          <w:szCs w:val="28"/>
-        </w:rPr>
-        <w:t>So</w:t>
-      </w:r>
-      <w:proofErr w:type="gramEnd"/>
-      <w:r>
-        <w:rPr>
-          <w:sz w:val="28"/>
-          <w:szCs w:val="28"/>
-        </w:rPr>
-        <w:t xml:space="preserve"> there are two separate concepts:</w:t>
-      </w:r>
-    </w:p>
-    <w:p>
-      <w:pPr>
-        <w:rPr>
-          <w:sz w:val="28"/>
-          <w:szCs w:val="28"/>
-        </w:rPr>
-      </w:pPr>
-      <w:r>
-        <w:rPr>
-          <w:b/>
-          <w:bCs/>
-          <w:sz w:val="28"/>
-          <w:szCs w:val="28"/>
-        </w:rPr>
         <w:t>Normal timer = fixed</w:t>
       </w:r>
     </w:p>
@@ -5402,52 +5071,52 @@
           <w:sz w:val="28"/>
           <w:szCs w:val="28"/>
         </w:rPr>
+        <w:t>Lane 3 → Priority 1</w:t>
+      </w:r>
+    </w:p>
+    <w:p>
+      <w:pPr>
+        <w:rPr>
+          <w:sz w:val="28"/>
+          <w:szCs w:val="28"/>
+        </w:rPr>
+      </w:pPr>
+      <w:r>
+        <w:rPr>
+          <w:sz w:val="28"/>
+          <w:szCs w:val="28"/>
+        </w:rPr>
+        <w:t>Lane 1 → Priority 2</w:t>
+      </w:r>
+    </w:p>
+    <w:p>
+      <w:pPr>
+        <w:rPr>
+          <w:sz w:val="28"/>
+          <w:szCs w:val="28"/>
+        </w:rPr>
+      </w:pPr>
+      <w:r>
+        <w:rPr>
+          <w:sz w:val="28"/>
+          <w:szCs w:val="28"/>
+        </w:rPr>
+        <w:t>After Lane 3's emergency vehicle clears:</w:t>
+      </w:r>
+    </w:p>
+    <w:p>
+      <w:pPr>
+        <w:rPr>
+          <w:sz w:val="28"/>
+          <w:szCs w:val="28"/>
+        </w:rPr>
+      </w:pPr>
+      <w:r>
+        <w:rPr>
+          <w:sz w:val="28"/>
+          <w:szCs w:val="28"/>
+        </w:rPr>
         <w:lastRenderedPageBreak/>
-        <w:t>Lane 3 → Priority 1</w:t>
-      </w:r>
-    </w:p>
-    <w:p>
-      <w:pPr>
-        <w:rPr>
-          <w:sz w:val="28"/>
-          <w:szCs w:val="28"/>
-        </w:rPr>
-      </w:pPr>
-      <w:r>
-        <w:rPr>
-          <w:sz w:val="28"/>
-          <w:szCs w:val="28"/>
-        </w:rPr>
-        <w:t>Lane 1 → Priority 2</w:t>
-      </w:r>
-    </w:p>
-    <w:p>
-      <w:pPr>
-        <w:rPr>
-          <w:sz w:val="28"/>
-          <w:szCs w:val="28"/>
-        </w:rPr>
-      </w:pPr>
-      <w:r>
-        <w:rPr>
-          <w:sz w:val="28"/>
-          <w:szCs w:val="28"/>
-        </w:rPr>
-        <w:t>After Lane 3's emergency vehicle clears:</w:t>
-      </w:r>
-    </w:p>
-    <w:p>
-      <w:pPr>
-        <w:rPr>
-          <w:sz w:val="28"/>
-          <w:szCs w:val="28"/>
-        </w:rPr>
-      </w:pPr>
-      <w:r>
-        <w:rPr>
-          <w:sz w:val="28"/>
-          <w:szCs w:val="28"/>
-        </w:rPr>
         <w:t>6–7 sec clearance</w:t>
       </w:r>
     </w:p>
@@ -5845,52 +5514,52 @@
           <w:sz w:val="28"/>
           <w:szCs w:val="28"/>
         </w:rPr>
+        <w:t>Select next lane</w:t>
+      </w:r>
+    </w:p>
+    <w:p>
+      <w:pPr>
+        <w:rPr>
+          <w:sz w:val="28"/>
+          <w:szCs w:val="28"/>
+        </w:rPr>
+      </w:pPr>
+      <w:r>
+        <w:rPr>
+          <w:sz w:val="28"/>
+          <w:szCs w:val="28"/>
+        </w:rPr>
+        <w:t xml:space="preserve">      ↓</w:t>
+      </w:r>
+    </w:p>
+    <w:p>
+      <w:pPr>
+        <w:rPr>
+          <w:sz w:val="28"/>
+          <w:szCs w:val="28"/>
+        </w:rPr>
+      </w:pPr>
+      <w:r>
+        <w:rPr>
+          <w:sz w:val="28"/>
+          <w:szCs w:val="28"/>
+        </w:rPr>
+        <w:t>Calculate new green time</w:t>
+      </w:r>
+    </w:p>
+    <w:p>
+      <w:pPr>
+        <w:rPr>
+          <w:sz w:val="28"/>
+          <w:szCs w:val="28"/>
+        </w:rPr>
+      </w:pPr>
+      <w:r>
+        <w:rPr>
+          <w:sz w:val="28"/>
+          <w:szCs w:val="28"/>
+        </w:rPr>
         <w:lastRenderedPageBreak/>
-        <w:t>Select next lane</w:t>
-      </w:r>
-    </w:p>
-    <w:p>
-      <w:pPr>
-        <w:rPr>
-          <w:sz w:val="28"/>
-          <w:szCs w:val="28"/>
-        </w:rPr>
-      </w:pPr>
-      <w:r>
-        <w:rPr>
-          <w:sz w:val="28"/>
-          <w:szCs w:val="28"/>
-        </w:rPr>
-        <w:t xml:space="preserve">      ↓</w:t>
-      </w:r>
-    </w:p>
-    <w:p>
-      <w:pPr>
-        <w:rPr>
-          <w:sz w:val="28"/>
-          <w:szCs w:val="28"/>
-        </w:rPr>
-      </w:pPr>
-      <w:r>
-        <w:rPr>
-          <w:sz w:val="28"/>
-          <w:szCs w:val="28"/>
-        </w:rPr>
-        <w:t>Calculate new green time</w:t>
-      </w:r>
-    </w:p>
-    <w:p>
-      <w:pPr>
-        <w:rPr>
-          <w:sz w:val="28"/>
-          <w:szCs w:val="28"/>
-        </w:rPr>
-      </w:pPr>
-      <w:r>
-        <w:rPr>
-          <w:sz w:val="28"/>
-          <w:szCs w:val="28"/>
-        </w:rPr>
         <w:t xml:space="preserve">      ↓</w:t>
       </w:r>
     </w:p>
@@ -6193,56 +5862,56 @@
           <w:sz w:val="28"/>
           <w:szCs w:val="28"/>
         </w:rPr>
+        <w:t>20. Complete Final Algorithm</w:t>
+      </w:r>
+    </w:p>
+    <w:p>
+      <w:pPr>
+        <w:rPr>
+          <w:b/>
+          <w:bCs/>
+          <w:sz w:val="28"/>
+          <w:szCs w:val="28"/>
+        </w:rPr>
+      </w:pPr>
+      <w:r>
+        <w:rPr>
+          <w:b/>
+          <w:bCs/>
+          <w:sz w:val="28"/>
+          <w:szCs w:val="28"/>
+        </w:rPr>
+        <w:t>Algorithm: AI-Based Dynamic Traffic Signal Control with Emergency Priority</w:t>
+      </w:r>
+    </w:p>
+    <w:p>
+      <w:pPr>
+        <w:rPr>
+          <w:sz w:val="28"/>
+          <w:szCs w:val="28"/>
+        </w:rPr>
+      </w:pPr>
+      <w:r>
+        <w:rPr>
+          <w:sz w:val="28"/>
+          <w:szCs w:val="28"/>
+        </w:rPr>
+        <w:t>START</w:t>
+      </w:r>
+    </w:p>
+    <w:p>
+      <w:pPr>
+        <w:rPr>
+          <w:sz w:val="28"/>
+          <w:szCs w:val="28"/>
+        </w:rPr>
+      </w:pPr>
+      <w:r>
+        <w:rPr>
+          <w:sz w:val="28"/>
+          <w:szCs w:val="28"/>
+        </w:rPr>
         <w:lastRenderedPageBreak/>
-        <w:t>20. Complete Final Algorithm</w:t>
-      </w:r>
-    </w:p>
-    <w:p>
-      <w:pPr>
-        <w:rPr>
-          <w:b/>
-          <w:bCs/>
-          <w:sz w:val="28"/>
-          <w:szCs w:val="28"/>
-        </w:rPr>
-      </w:pPr>
-      <w:r>
-        <w:rPr>
-          <w:b/>
-          <w:bCs/>
-          <w:sz w:val="28"/>
-          <w:szCs w:val="28"/>
-        </w:rPr>
-        <w:t>Algorithm: AI-Based Dynamic Traffic Signal Control with Emergency Priority</w:t>
-      </w:r>
-    </w:p>
-    <w:p>
-      <w:pPr>
-        <w:rPr>
-          <w:sz w:val="28"/>
-          <w:szCs w:val="28"/>
-        </w:rPr>
-      </w:pPr>
-      <w:r>
-        <w:rPr>
-          <w:sz w:val="28"/>
-          <w:szCs w:val="28"/>
-        </w:rPr>
-        <w:t>START</w:t>
-      </w:r>
-    </w:p>
-    <w:p>
-      <w:pPr>
-        <w:rPr>
-          <w:sz w:val="28"/>
-          <w:szCs w:val="28"/>
-        </w:rPr>
-      </w:pPr>
-      <w:r>
-        <w:rPr>
-          <w:sz w:val="28"/>
-          <w:szCs w:val="28"/>
-        </w:rPr>
         <w:t>1. Initialize four lanes:</w:t>
       </w:r>
     </w:p>
@@ -6476,7 +6145,6 @@
         </w:rPr>
         <w:t xml:space="preserve">e, </w:t>
       </w:r>
-      <w:proofErr w:type="gramStart"/>
       <w:r>
         <w:rPr>
           <w:sz w:val="28"/>
@@ -6489,9 +6157,656 @@
           <w:sz w:val="28"/>
           <w:szCs w:val="28"/>
         </w:rPr>
-        <w:t xml:space="preserve"> ,</w:t>
-      </w:r>
-      <w:proofErr w:type="gramEnd"/>
+        <w:t xml:space="preserve"> , </w:t>
+      </w:r>
+      <w:r>
+        <w:rPr>
+          <w:sz w:val="28"/>
+          <w:szCs w:val="28"/>
+        </w:rPr>
+        <w:t>Auto</w:t>
+      </w:r>
+      <w:r>
+        <w:rPr>
+          <w:sz w:val="28"/>
+          <w:szCs w:val="28"/>
+        </w:rPr>
+        <w:t xml:space="preserve"> , </w:t>
+      </w:r>
+      <w:r>
+        <w:rPr>
+          <w:sz w:val="28"/>
+          <w:szCs w:val="28"/>
+        </w:rPr>
+        <w:t>Bus</w:t>
+      </w:r>
+      <w:r>
+        <w:rPr>
+          <w:sz w:val="28"/>
+          <w:szCs w:val="28"/>
+        </w:rPr>
+        <w:t xml:space="preserve"> , </w:t>
+      </w:r>
+      <w:r>
+        <w:rPr>
+          <w:sz w:val="28"/>
+          <w:szCs w:val="28"/>
+        </w:rPr>
+        <w:t>Truck</w:t>
+      </w:r>
+      <w:r>
+        <w:rPr>
+          <w:sz w:val="28"/>
+          <w:szCs w:val="28"/>
+        </w:rPr>
+        <w:t xml:space="preserve"> , </w:t>
+      </w:r>
+      <w:r>
+        <w:rPr>
+          <w:sz w:val="28"/>
+          <w:szCs w:val="28"/>
+        </w:rPr>
+        <w:t>Ambulance</w:t>
+      </w:r>
+      <w:r>
+        <w:rPr>
+          <w:sz w:val="28"/>
+          <w:szCs w:val="28"/>
+        </w:rPr>
+        <w:t xml:space="preserve"> , </w:t>
+      </w:r>
+      <w:r>
+        <w:rPr>
+          <w:sz w:val="28"/>
+          <w:szCs w:val="28"/>
+        </w:rPr>
+        <w:t>Fire Brigade</w:t>
+      </w:r>
+    </w:p>
+    <w:p>
+      <w:pPr>
+        <w:rPr>
+          <w:sz w:val="28"/>
+          <w:szCs w:val="28"/>
+        </w:rPr>
+      </w:pPr>
+      <w:r>
+        <w:rPr>
+          <w:sz w:val="28"/>
+          <w:szCs w:val="28"/>
+        </w:rPr>
+        <w:t>8. Assign every detected vehicle to its respective lane.</w:t>
+      </w:r>
+    </w:p>
+    <w:p>
+      <w:pPr>
+        <w:rPr>
+          <w:sz w:val="28"/>
+          <w:szCs w:val="28"/>
+        </w:rPr>
+      </w:pPr>
+      <w:r>
+        <w:rPr>
+          <w:sz w:val="28"/>
+          <w:szCs w:val="28"/>
+        </w:rPr>
+        <w:t>9. Count vehicles in each lane.</w:t>
+      </w:r>
+    </w:p>
+    <w:p>
+      <w:pPr>
+        <w:rPr>
+          <w:sz w:val="28"/>
+          <w:szCs w:val="28"/>
+        </w:rPr>
+      </w:pPr>
+      <w:r>
+        <w:rPr>
+          <w:sz w:val="28"/>
+          <w:szCs w:val="28"/>
+        </w:rPr>
+        <w:t>10. Calculate vehicle-type demand:</w:t>
+      </w:r>
+    </w:p>
+    <w:p>
+      <w:pPr>
+        <w:rPr>
+          <w:sz w:val="28"/>
+          <w:szCs w:val="28"/>
+        </w:rPr>
+      </w:pPr>
+      <w:r>
+        <w:rPr>
+          <w:sz w:val="28"/>
+          <w:szCs w:val="28"/>
+        </w:rPr>
+        <w:t xml:space="preserve">       Demand = Σ(Type Count × Type Weight)</w:t>
+      </w:r>
+    </w:p>
+    <w:p>
+      <w:pPr>
+        <w:rPr>
+          <w:sz w:val="28"/>
+          <w:szCs w:val="28"/>
+        </w:rPr>
+      </w:pPr>
+      <w:r>
+        <w:rPr>
+          <w:sz w:val="28"/>
+          <w:szCs w:val="28"/>
+        </w:rPr>
+        <w:t>13. Check for emergency vehicles.</w:t>
+      </w:r>
+    </w:p>
+    <w:p>
+      <w:pPr>
+        <w:rPr>
+          <w:sz w:val="28"/>
+          <w:szCs w:val="28"/>
+        </w:rPr>
+      </w:pPr>
+      <w:r>
+        <w:rPr>
+          <w:sz w:val="28"/>
+          <w:szCs w:val="28"/>
+        </w:rPr>
+        <w:t>14. IF emergency vehicle is detected:</w:t>
+      </w:r>
+    </w:p>
+    <w:p>
+      <w:pPr>
+        <w:rPr>
+          <w:sz w:val="28"/>
+          <w:szCs w:val="28"/>
+        </w:rPr>
+      </w:pPr>
+      <w:r>
+        <w:rPr>
+          <w:sz w:val="28"/>
+          <w:szCs w:val="28"/>
+        </w:rPr>
+        <w:t xml:space="preserve">       Enter EMERGENCY MODE.</w:t>
+      </w:r>
+    </w:p>
+    <w:p>
+      <w:pPr>
+        <w:rPr>
+          <w:sz w:val="28"/>
+          <w:szCs w:val="28"/>
+        </w:rPr>
+      </w:pPr>
+      <w:r>
+        <w:rPr>
+          <w:sz w:val="28"/>
+          <w:szCs w:val="28"/>
+        </w:rPr>
+        <w:t>15. Identify all emergency vehicles.</w:t>
+      </w:r>
+    </w:p>
+    <w:p>
+      <w:pPr>
+        <w:rPr>
+          <w:sz w:val="28"/>
+          <w:szCs w:val="28"/>
+        </w:rPr>
+      </w:pPr>
+      <w:r>
+        <w:rPr>
+          <w:sz w:val="28"/>
+          <w:szCs w:val="28"/>
+        </w:rPr>
+        <w:t>17. Select the highest-priority emergency vehicle.</w:t>
+      </w:r>
+    </w:p>
+    <w:p>
+      <w:pPr>
+        <w:rPr>
+          <w:sz w:val="28"/>
+          <w:szCs w:val="28"/>
+        </w:rPr>
+      </w:pPr>
+      <w:r>
+        <w:rPr>
+          <w:sz w:val="28"/>
+          <w:szCs w:val="28"/>
+        </w:rPr>
+        <w:t>18. IF emergency vehicle is in the CURRENT GREEN LANE:</w:t>
+      </w:r>
+    </w:p>
+    <w:p>
+      <w:pPr>
+        <w:rPr>
+          <w:sz w:val="28"/>
+          <w:szCs w:val="28"/>
+        </w:rPr>
+      </w:pPr>
+      <w:r>
+        <w:rPr>
+          <w:sz w:val="28"/>
+          <w:szCs w:val="28"/>
+        </w:rPr>
+        <w:t xml:space="preserve">       Continue the existing green timer</w:t>
+      </w:r>
+      <w:r>
+        <w:rPr>
+          <w:sz w:val="28"/>
+          <w:szCs w:val="28"/>
+        </w:rPr>
+        <w:t>.</w:t>
+      </w:r>
+    </w:p>
+    <w:p>
+      <w:pPr>
+        <w:rPr>
+          <w:sz w:val="28"/>
+          <w:szCs w:val="28"/>
+        </w:rPr>
+      </w:pPr>
+      <w:r>
+        <w:rPr>
+          <w:sz w:val="28"/>
+          <w:szCs w:val="28"/>
+        </w:rPr>
+        <w:t xml:space="preserve">       IF timer reaches zero AND emergency vehicle</w:t>
+      </w:r>
+    </w:p>
+    <w:p>
+      <w:pPr>
+        <w:rPr>
+          <w:sz w:val="28"/>
+          <w:szCs w:val="28"/>
+        </w:rPr>
+      </w:pPr>
+      <w:r>
+        <w:rPr>
+          <w:sz w:val="28"/>
+          <w:szCs w:val="28"/>
+        </w:rPr>
+        <w:t xml:space="preserve">       has not crossed:</w:t>
+      </w:r>
+    </w:p>
+    <w:p>
+      <w:pPr>
+        <w:rPr>
+          <w:sz w:val="28"/>
+          <w:szCs w:val="28"/>
+        </w:rPr>
+      </w:pPr>
+      <w:r>
+        <w:rPr>
+          <w:sz w:val="28"/>
+          <w:szCs w:val="28"/>
+        </w:rPr>
+        <w:t xml:space="preserve">             Keep lane GREEN.</w:t>
+      </w:r>
+    </w:p>
+    <w:p>
+      <w:pPr>
+        <w:rPr>
+          <w:sz w:val="28"/>
+          <w:szCs w:val="28"/>
+        </w:rPr>
+      </w:pPr>
+      <w:r>
+        <w:rPr>
+          <w:sz w:val="28"/>
+          <w:szCs w:val="28"/>
+        </w:rPr>
+        <w:lastRenderedPageBreak/>
+        <w:t xml:space="preserve">             Allow emergency vehicle to pass.</w:t>
+      </w:r>
+    </w:p>
+    <w:p>
+      <w:pPr>
+        <w:rPr>
+          <w:sz w:val="28"/>
+          <w:szCs w:val="28"/>
+        </w:rPr>
+      </w:pPr>
+      <w:r>
+        <w:rPr>
+          <w:sz w:val="28"/>
+          <w:szCs w:val="28"/>
+        </w:rPr>
+        <w:t xml:space="preserve">       </w:t>
+      </w:r>
+    </w:p>
+    <w:p>
+      <w:pPr>
+        <w:rPr>
+          <w:sz w:val="28"/>
+          <w:szCs w:val="28"/>
+        </w:rPr>
+      </w:pPr>
+      <w:r>
+        <w:rPr>
+          <w:sz w:val="28"/>
+          <w:szCs w:val="28"/>
+        </w:rPr>
+        <w:t xml:space="preserve">       After emergency vehicle clears:</w:t>
+      </w:r>
+    </w:p>
+    <w:p>
+      <w:pPr>
+        <w:rPr>
+          <w:sz w:val="28"/>
+          <w:szCs w:val="28"/>
+        </w:rPr>
+      </w:pPr>
+      <w:r>
+        <w:rPr>
+          <w:sz w:val="28"/>
+          <w:szCs w:val="28"/>
+        </w:rPr>
+        <w:t xml:space="preserve">             Wait emergency clearance period.</w:t>
+      </w:r>
+    </w:p>
+    <w:p>
+      <w:pPr>
+        <w:rPr>
+          <w:sz w:val="28"/>
+          <w:szCs w:val="28"/>
+        </w:rPr>
+      </w:pPr>
+      <w:r>
+        <w:rPr>
+          <w:sz w:val="28"/>
+          <w:szCs w:val="28"/>
+        </w:rPr>
+        <w:t xml:space="preserve">             Change GREEN → YELLOW → ALL RED.</w:t>
+      </w:r>
+    </w:p>
+    <w:p>
+      <w:pPr>
+        <w:rPr>
+          <w:color w:val="EE0000"/>
+          <w:sz w:val="28"/>
+          <w:szCs w:val="28"/>
+        </w:rPr>
+      </w:pPr>
+      <w:r>
+        <w:rPr>
+          <w:sz w:val="28"/>
+          <w:szCs w:val="28"/>
+        </w:rPr>
+        <w:t xml:space="preserve">19. </w:t>
+      </w:r>
+      <w:r>
+        <w:rPr>
+          <w:color w:val="EE0000"/>
+          <w:sz w:val="28"/>
+          <w:szCs w:val="28"/>
+        </w:rPr>
+        <w:t>ELSE IF emergency vehicle is in a RED LANE:</w:t>
+      </w:r>
+    </w:p>
+    <w:p>
+      <w:pPr>
+        <w:rPr>
+          <w:sz w:val="28"/>
+          <w:szCs w:val="28"/>
+        </w:rPr>
+      </w:pPr>
+      <w:r>
+        <w:rPr>
+          <w:sz w:val="28"/>
+          <w:szCs w:val="28"/>
+        </w:rPr>
+        <w:t xml:space="preserve">       Do not modify the current green timer.</w:t>
+      </w:r>
+    </w:p>
+    <w:p>
+      <w:pPr>
+        <w:rPr>
+          <w:sz w:val="28"/>
+          <w:szCs w:val="28"/>
+        </w:rPr>
+      </w:pPr>
+      <w:r>
+        <w:rPr>
+          <w:sz w:val="28"/>
+          <w:szCs w:val="28"/>
+        </w:rPr>
+        <w:t xml:space="preserve">       Allow current green timer to finish.</w:t>
+      </w:r>
+    </w:p>
+    <w:p>
+      <w:pPr>
+        <w:rPr>
+          <w:sz w:val="28"/>
+          <w:szCs w:val="28"/>
+        </w:rPr>
+      </w:pPr>
+      <w:r>
+        <w:rPr>
+          <w:sz w:val="28"/>
+          <w:szCs w:val="28"/>
+        </w:rPr>
+        <w:t xml:space="preserve">       Change:</w:t>
+      </w:r>
+    </w:p>
+    <w:p>
+      <w:pPr>
+        <w:rPr>
+          <w:sz w:val="28"/>
+          <w:szCs w:val="28"/>
+        </w:rPr>
+      </w:pPr>
+      <w:r>
+        <w:rPr>
+          <w:sz w:val="28"/>
+          <w:szCs w:val="28"/>
+        </w:rPr>
+        <w:t xml:space="preserve">             GREEN → YELLOW → ALL RED</w:t>
+      </w:r>
+    </w:p>
+    <w:p>
+      <w:pPr>
+        <w:rPr>
+          <w:sz w:val="28"/>
+          <w:szCs w:val="28"/>
+        </w:rPr>
+      </w:pPr>
+      <w:r>
+        <w:rPr>
+          <w:sz w:val="28"/>
+          <w:szCs w:val="28"/>
+        </w:rPr>
+        <w:t xml:space="preserve">       Give GREEN to emergency lane</w:t>
+      </w:r>
+    </w:p>
+    <w:p>
+      <w:pPr>
+        <w:rPr>
+          <w:sz w:val="28"/>
+          <w:szCs w:val="28"/>
+        </w:rPr>
+      </w:pPr>
+      <w:r>
+        <w:rPr>
+          <w:sz w:val="28"/>
+          <w:szCs w:val="28"/>
+        </w:rPr>
+        <w:t>20. Monitor emergency vehicle continuously.</w:t>
+      </w:r>
+    </w:p>
+    <w:p>
+      <w:pPr>
+        <w:rPr>
+          <w:sz w:val="28"/>
+          <w:szCs w:val="28"/>
+        </w:rPr>
+      </w:pPr>
+      <w:r>
+        <w:rPr>
+          <w:sz w:val="28"/>
+          <w:szCs w:val="28"/>
+        </w:rPr>
+        <w:t>21. Confirm that emergency vehicle has cleared the ROI.</w:t>
+      </w:r>
+    </w:p>
+    <w:p>
+      <w:pPr>
+        <w:rPr>
+          <w:sz w:val="28"/>
+          <w:szCs w:val="28"/>
+        </w:rPr>
+      </w:pPr>
+      <w:r>
+        <w:rPr>
+          <w:sz w:val="28"/>
+          <w:szCs w:val="28"/>
+        </w:rPr>
+        <w:t>22. Provide the defined 6–7 second emergency clearance period.</w:t>
+      </w:r>
+    </w:p>
+    <w:p>
+      <w:pPr>
+        <w:rPr>
+          <w:sz w:val="28"/>
+          <w:szCs w:val="28"/>
+        </w:rPr>
+      </w:pPr>
+      <w:r>
+        <w:rPr>
+          <w:sz w:val="28"/>
+          <w:szCs w:val="28"/>
+        </w:rPr>
+        <w:t>23. If another emergency vehicle is present:</w:t>
+      </w:r>
+    </w:p>
+    <w:p>
+      <w:pPr>
+        <w:rPr>
+          <w:sz w:val="28"/>
+          <w:szCs w:val="28"/>
+        </w:rPr>
+      </w:pPr>
+      <w:r>
+        <w:rPr>
+          <w:sz w:val="28"/>
+          <w:szCs w:val="28"/>
+        </w:rPr>
+        <w:t xml:space="preserve">       Recalculate its priority.</w:t>
+      </w:r>
+    </w:p>
+    <w:p>
+      <w:pPr>
+        <w:rPr>
+          <w:sz w:val="28"/>
+          <w:szCs w:val="28"/>
+        </w:rPr>
+      </w:pPr>
+      <w:r>
+        <w:rPr>
+          <w:sz w:val="28"/>
+          <w:szCs w:val="28"/>
+        </w:rPr>
+        <w:t xml:space="preserve">       Repeat emergency handling.</w:t>
+      </w:r>
+    </w:p>
+    <w:p>
+      <w:pPr>
+        <w:rPr>
+          <w:sz w:val="28"/>
+          <w:szCs w:val="28"/>
+        </w:rPr>
+      </w:pPr>
+      <w:r>
+        <w:rPr>
+          <w:sz w:val="28"/>
+          <w:szCs w:val="28"/>
+        </w:rPr>
+        <w:t>24. If no emergency vehicle remains:</w:t>
+      </w:r>
+    </w:p>
+    <w:p>
+      <w:pPr>
+        <w:rPr>
+          <w:sz w:val="28"/>
+          <w:szCs w:val="28"/>
+        </w:rPr>
+      </w:pPr>
+      <w:r>
+        <w:rPr>
+          <w:sz w:val="28"/>
+          <w:szCs w:val="28"/>
+        </w:rPr>
+        <w:t xml:space="preserve">       Exit EMERGENCY MODE.</w:t>
+      </w:r>
+    </w:p>
+    <w:p>
+      <w:pPr>
+        <w:rPr>
+          <w:sz w:val="28"/>
+          <w:szCs w:val="28"/>
+        </w:rPr>
+      </w:pPr>
+      <w:r>
+        <w:rPr>
+          <w:sz w:val="28"/>
+          <w:szCs w:val="28"/>
+        </w:rPr>
+        <w:t>25. Enter NORMAL MODE.</w:t>
+      </w:r>
+    </w:p>
+    <w:p>
+      <w:pPr>
+        <w:rPr>
+          <w:sz w:val="28"/>
+          <w:szCs w:val="28"/>
+        </w:rPr>
+      </w:pPr>
+      <w:r>
+        <w:rPr>
+          <w:sz w:val="28"/>
+          <w:szCs w:val="28"/>
+        </w:rPr>
+        <w:t>26. Recalculate traffic information for all lanes:</w:t>
+      </w:r>
+    </w:p>
+    <w:p>
+      <w:pPr>
+        <w:rPr>
+          <w:sz w:val="28"/>
+          <w:szCs w:val="28"/>
+        </w:rPr>
+      </w:pPr>
+      <w:r>
+        <w:rPr>
+          <w:sz w:val="28"/>
+          <w:szCs w:val="28"/>
+        </w:rPr>
+        <w:t xml:space="preserve">       Vehicle Count</w:t>
+      </w:r>
+      <w:r>
+        <w:rPr>
+          <w:sz w:val="28"/>
+          <w:szCs w:val="28"/>
+        </w:rPr>
+        <w:t xml:space="preserve"> , </w:t>
+      </w:r>
+      <w:r>
+        <w:rPr>
+          <w:sz w:val="28"/>
+          <w:szCs w:val="28"/>
+        </w:rPr>
+        <w:t>Vehicle Type</w:t>
+      </w:r>
+      <w:r>
+        <w:rPr>
+          <w:sz w:val="28"/>
+          <w:szCs w:val="28"/>
+        </w:rPr>
+        <w:t xml:space="preserve"> , </w:t>
+      </w:r>
+      <w:r>
+        <w:rPr>
+          <w:sz w:val="28"/>
+          <w:szCs w:val="28"/>
+        </w:rPr>
+        <w:t>Traffic Demand</w:t>
+      </w:r>
       <w:r>
         <w:rPr>
           <w:sz w:val="28"/>
@@ -6499,290 +6814,111 @@
         </w:rPr>
         <w:t xml:space="preserve"> </w:t>
       </w:r>
-      <w:proofErr w:type="gramStart"/>
-      <w:r>
-        <w:rPr>
-          <w:sz w:val="28"/>
-          <w:szCs w:val="28"/>
-        </w:rPr>
-        <w:t>Auto</w:t>
-      </w:r>
-      <w:r>
-        <w:rPr>
-          <w:sz w:val="28"/>
-          <w:szCs w:val="28"/>
-        </w:rPr>
-        <w:t xml:space="preserve"> ,</w:t>
-      </w:r>
-      <w:proofErr w:type="gramEnd"/>
-      <w:r>
-        <w:rPr>
-          <w:sz w:val="28"/>
-          <w:szCs w:val="28"/>
-        </w:rPr>
-        <w:t xml:space="preserve"> </w:t>
-      </w:r>
-      <w:proofErr w:type="gramStart"/>
-      <w:r>
-        <w:rPr>
-          <w:sz w:val="28"/>
-          <w:szCs w:val="28"/>
-        </w:rPr>
-        <w:t>Bus</w:t>
-      </w:r>
-      <w:r>
-        <w:rPr>
-          <w:sz w:val="28"/>
-          <w:szCs w:val="28"/>
-        </w:rPr>
-        <w:t xml:space="preserve"> ,</w:t>
-      </w:r>
-      <w:proofErr w:type="gramEnd"/>
-      <w:r>
-        <w:rPr>
-          <w:sz w:val="28"/>
-          <w:szCs w:val="28"/>
-        </w:rPr>
-        <w:t xml:space="preserve"> </w:t>
-      </w:r>
-      <w:proofErr w:type="gramStart"/>
-      <w:r>
-        <w:rPr>
-          <w:sz w:val="28"/>
-          <w:szCs w:val="28"/>
-        </w:rPr>
-        <w:t>Truck</w:t>
-      </w:r>
-      <w:r>
-        <w:rPr>
-          <w:sz w:val="28"/>
-          <w:szCs w:val="28"/>
-        </w:rPr>
-        <w:t xml:space="preserve"> ,</w:t>
-      </w:r>
-      <w:proofErr w:type="gramEnd"/>
-      <w:r>
-        <w:rPr>
-          <w:sz w:val="28"/>
-          <w:szCs w:val="28"/>
-        </w:rPr>
-        <w:t xml:space="preserve"> </w:t>
-      </w:r>
-      <w:proofErr w:type="gramStart"/>
-      <w:r>
-        <w:rPr>
-          <w:sz w:val="28"/>
-          <w:szCs w:val="28"/>
-        </w:rPr>
-        <w:t>Ambulance</w:t>
-      </w:r>
-      <w:r>
-        <w:rPr>
-          <w:sz w:val="28"/>
-          <w:szCs w:val="28"/>
-        </w:rPr>
-        <w:t xml:space="preserve"> ,</w:t>
-      </w:r>
-      <w:proofErr w:type="gramEnd"/>
-      <w:r>
-        <w:rPr>
-          <w:sz w:val="28"/>
-          <w:szCs w:val="28"/>
-        </w:rPr>
-        <w:t xml:space="preserve"> </w:t>
-      </w:r>
-      <w:r>
-        <w:rPr>
-          <w:sz w:val="28"/>
-          <w:szCs w:val="28"/>
-        </w:rPr>
-        <w:t>Fire Brigade</w:t>
-      </w:r>
-    </w:p>
-    <w:p>
-      <w:pPr>
-        <w:rPr>
-          <w:sz w:val="28"/>
-          <w:szCs w:val="28"/>
-        </w:rPr>
-      </w:pPr>
-      <w:r>
-        <w:rPr>
-          <w:sz w:val="28"/>
-          <w:szCs w:val="28"/>
-        </w:rPr>
-        <w:t>8. Assign every detected vehicle to its respective lane.</w:t>
-      </w:r>
-    </w:p>
-    <w:p>
-      <w:pPr>
-        <w:rPr>
-          <w:sz w:val="28"/>
-          <w:szCs w:val="28"/>
-        </w:rPr>
-      </w:pPr>
-      <w:r>
-        <w:rPr>
-          <w:sz w:val="28"/>
-          <w:szCs w:val="28"/>
-        </w:rPr>
-        <w:t>9. Count vehicles in each lane.</w:t>
-      </w:r>
-    </w:p>
-    <w:p>
-      <w:pPr>
-        <w:rPr>
-          <w:sz w:val="28"/>
-          <w:szCs w:val="28"/>
-        </w:rPr>
-      </w:pPr>
-      <w:r>
-        <w:rPr>
-          <w:sz w:val="28"/>
-          <w:szCs w:val="28"/>
-        </w:rPr>
-        <w:t>10. Calculate vehicle-type demand:</w:t>
-      </w:r>
-    </w:p>
-    <w:p>
-      <w:pPr>
-        <w:rPr>
-          <w:sz w:val="28"/>
-          <w:szCs w:val="28"/>
-        </w:rPr>
-      </w:pPr>
-      <w:r>
-        <w:rPr>
-          <w:sz w:val="28"/>
-          <w:szCs w:val="28"/>
-        </w:rPr>
-        <w:t xml:space="preserve">       Demand = </w:t>
-      </w:r>
-      <w:proofErr w:type="gramStart"/>
-      <w:r>
-        <w:rPr>
-          <w:sz w:val="28"/>
-          <w:szCs w:val="28"/>
-        </w:rPr>
-        <w:t>Σ(</w:t>
-      </w:r>
-      <w:proofErr w:type="gramEnd"/>
-      <w:r>
-        <w:rPr>
-          <w:sz w:val="28"/>
-          <w:szCs w:val="28"/>
-        </w:rPr>
-        <w:t>Type Count × Type Weight)</w:t>
-      </w:r>
-    </w:p>
-    <w:p>
-      <w:pPr>
-        <w:rPr>
-          <w:color w:val="EE0000"/>
-          <w:sz w:val="28"/>
-          <w:szCs w:val="28"/>
-        </w:rPr>
-      </w:pPr>
-      <w:r>
-        <w:rPr>
-          <w:sz w:val="28"/>
-          <w:szCs w:val="28"/>
-        </w:rPr>
-        <w:t xml:space="preserve">11. </w:t>
-      </w:r>
-      <w:r>
-        <w:rPr>
-          <w:color w:val="EE0000"/>
-          <w:sz w:val="28"/>
-          <w:szCs w:val="28"/>
-        </w:rPr>
-        <w:t>Calculate queue length.</w:t>
-      </w:r>
-    </w:p>
-    <w:p>
-      <w:pPr>
-        <w:rPr>
-          <w:color w:val="EE0000"/>
-          <w:sz w:val="28"/>
-          <w:szCs w:val="28"/>
-        </w:rPr>
-      </w:pPr>
-      <w:r>
-        <w:rPr>
-          <w:color w:val="EE0000"/>
-          <w:sz w:val="28"/>
-          <w:szCs w:val="28"/>
-        </w:rPr>
-        <w:t>12. Calculate waiting time.</w:t>
-      </w:r>
-    </w:p>
-    <w:p>
-      <w:pPr>
-        <w:rPr>
-          <w:sz w:val="28"/>
-          <w:szCs w:val="28"/>
-        </w:rPr>
-      </w:pPr>
-      <w:r>
-        <w:rPr>
-          <w:sz w:val="28"/>
-          <w:szCs w:val="28"/>
-        </w:rPr>
-        <w:t>13. Check for emergency vehicles.</w:t>
-      </w:r>
-    </w:p>
-    <w:p>
-      <w:pPr>
-        <w:rPr>
-          <w:sz w:val="28"/>
-          <w:szCs w:val="28"/>
-        </w:rPr>
-      </w:pPr>
-      <w:r>
-        <w:rPr>
-          <w:sz w:val="28"/>
-          <w:szCs w:val="28"/>
-        </w:rPr>
-        <w:t>14. IF emergency vehicle is detected:</w:t>
-      </w:r>
-    </w:p>
-    <w:p>
-      <w:pPr>
-        <w:rPr>
-          <w:sz w:val="28"/>
-          <w:szCs w:val="28"/>
-        </w:rPr>
-      </w:pPr>
-      <w:r>
-        <w:rPr>
-          <w:sz w:val="28"/>
-          <w:szCs w:val="28"/>
-        </w:rPr>
-        <w:t xml:space="preserve">       Enter EMERGENCY MODE.</w:t>
-      </w:r>
-    </w:p>
-    <w:p>
-      <w:pPr>
-        <w:rPr>
-          <w:sz w:val="28"/>
-          <w:szCs w:val="28"/>
-        </w:rPr>
-      </w:pPr>
-      <w:r>
-        <w:rPr>
-          <w:sz w:val="28"/>
-          <w:szCs w:val="28"/>
-        </w:rPr>
-        <w:t>15. Identify all emergency vehicles.</w:t>
-      </w:r>
-    </w:p>
-    <w:p>
-      <w:pPr>
-        <w:rPr>
-          <w:sz w:val="28"/>
-          <w:szCs w:val="28"/>
-        </w:rPr>
-      </w:pPr>
+    </w:p>
+    <w:p>
+      <w:pPr>
+        <w:rPr>
+          <w:sz w:val="28"/>
+          <w:szCs w:val="28"/>
+        </w:rPr>
+      </w:pPr>
+      <w:r>
+        <w:rPr>
+          <w:sz w:val="28"/>
+          <w:szCs w:val="28"/>
+        </w:rPr>
+        <w:t>27. Check maximum waiting condition.</w:t>
+      </w:r>
+    </w:p>
+    <w:p>
+      <w:pPr>
+        <w:rPr>
+          <w:sz w:val="28"/>
+          <w:szCs w:val="28"/>
+        </w:rPr>
+      </w:pPr>
+      <w:r>
+        <w:rPr>
+          <w:sz w:val="28"/>
+          <w:szCs w:val="28"/>
+        </w:rPr>
+        <w:t>28. Calculate priority score for each eligible lane.</w:t>
+      </w:r>
+    </w:p>
+    <w:p>
+      <w:pPr>
+        <w:rPr>
+          <w:sz w:val="28"/>
+          <w:szCs w:val="28"/>
+        </w:rPr>
+      </w:pPr>
+      <w:r>
+        <w:rPr>
+          <w:sz w:val="28"/>
+          <w:szCs w:val="28"/>
+        </w:rPr>
+        <w:t>29. Select the next lane:</w:t>
+      </w:r>
+    </w:p>
+    <w:p>
+      <w:pPr>
+        <w:rPr>
+          <w:sz w:val="28"/>
+          <w:szCs w:val="28"/>
+        </w:rPr>
+      </w:pPr>
+      <w:r>
+        <w:rPr>
+          <w:sz w:val="28"/>
+          <w:szCs w:val="28"/>
+        </w:rPr>
+        <w:t xml:space="preserve">       Highest priority → selected lane.</w:t>
+      </w:r>
+    </w:p>
+    <w:p>
+      <w:pPr>
+        <w:rPr>
+          <w:sz w:val="28"/>
+          <w:szCs w:val="28"/>
+        </w:rPr>
+      </w:pPr>
+      <w:r>
+        <w:rPr>
+          <w:sz w:val="28"/>
+          <w:szCs w:val="28"/>
+        </w:rPr>
+        <w:t xml:space="preserve">       If priority is approximately equal:</w:t>
+      </w:r>
+    </w:p>
+    <w:p>
+      <w:pPr>
+        <w:rPr>
+          <w:sz w:val="28"/>
+          <w:szCs w:val="28"/>
+        </w:rPr>
+      </w:pPr>
+      <w:r>
+        <w:rPr>
+          <w:sz w:val="28"/>
+          <w:szCs w:val="28"/>
+        </w:rPr>
+        <w:t xml:space="preserve">             Follow clockwise sequence.</w:t>
+      </w:r>
+    </w:p>
+    <w:p>
+      <w:pPr>
+        <w:rPr>
+          <w:sz w:val="28"/>
+          <w:szCs w:val="28"/>
+        </w:rPr>
+      </w:pPr>
+      <w:r>
+        <w:rPr>
+          <w:sz w:val="28"/>
+          <w:szCs w:val="28"/>
+        </w:rPr>
+        <w:t>30. Calculate green time for selected lane.</w:t>
+      </w:r>
     </w:p>
     <w:p>
       <w:pPr>
@@ -6797,687 +6933,6 @@
           <w:szCs w:val="28"/>
         </w:rPr>
         <w:lastRenderedPageBreak/>
-        <w:t xml:space="preserve">16. </w:t>
-      </w:r>
-      <w:r>
-        <w:rPr>
-          <w:color w:val="EE0000"/>
-          <w:sz w:val="28"/>
-          <w:szCs w:val="28"/>
-        </w:rPr>
-        <w:t>Determine their lane and distance/ETA</w:t>
-      </w:r>
-      <w:r>
-        <w:rPr>
-          <w:sz w:val="28"/>
-          <w:szCs w:val="28"/>
-        </w:rPr>
-        <w:t>.</w:t>
-      </w:r>
-    </w:p>
-    <w:p>
-      <w:pPr>
-        <w:rPr>
-          <w:sz w:val="28"/>
-          <w:szCs w:val="28"/>
-        </w:rPr>
-      </w:pPr>
-      <w:r>
-        <w:rPr>
-          <w:sz w:val="28"/>
-          <w:szCs w:val="28"/>
-        </w:rPr>
-        <w:t>17. Select the highest-priority emergency vehicle.</w:t>
-      </w:r>
-    </w:p>
-    <w:p>
-      <w:pPr>
-        <w:rPr>
-          <w:sz w:val="28"/>
-          <w:szCs w:val="28"/>
-        </w:rPr>
-      </w:pPr>
-      <w:r>
-        <w:rPr>
-          <w:sz w:val="28"/>
-          <w:szCs w:val="28"/>
-        </w:rPr>
-        <w:t>18. IF emergency vehicle is in the CURRENT GREEN LANE:</w:t>
-      </w:r>
-    </w:p>
-    <w:p>
-      <w:pPr>
-        <w:rPr>
-          <w:sz w:val="28"/>
-          <w:szCs w:val="28"/>
-        </w:rPr>
-      </w:pPr>
-      <w:r>
-        <w:rPr>
-          <w:sz w:val="28"/>
-          <w:szCs w:val="28"/>
-        </w:rPr>
-        <w:t xml:space="preserve">       Continue the existing green timer</w:t>
-      </w:r>
-      <w:r>
-        <w:rPr>
-          <w:sz w:val="28"/>
-          <w:szCs w:val="28"/>
-        </w:rPr>
-        <w:t>.</w:t>
-      </w:r>
-    </w:p>
-    <w:p>
-      <w:pPr>
-        <w:rPr>
-          <w:sz w:val="28"/>
-          <w:szCs w:val="28"/>
-        </w:rPr>
-      </w:pPr>
-      <w:r>
-        <w:rPr>
-          <w:sz w:val="28"/>
-          <w:szCs w:val="28"/>
-        </w:rPr>
-        <w:t xml:space="preserve">       IF timer reaches zero AND emergency vehicle</w:t>
-      </w:r>
-    </w:p>
-    <w:p>
-      <w:pPr>
-        <w:rPr>
-          <w:sz w:val="28"/>
-          <w:szCs w:val="28"/>
-        </w:rPr>
-      </w:pPr>
-      <w:r>
-        <w:rPr>
-          <w:sz w:val="28"/>
-          <w:szCs w:val="28"/>
-        </w:rPr>
-        <w:t xml:space="preserve">       has not crossed:</w:t>
-      </w:r>
-    </w:p>
-    <w:p>
-      <w:pPr>
-        <w:rPr>
-          <w:sz w:val="28"/>
-          <w:szCs w:val="28"/>
-        </w:rPr>
-      </w:pPr>
-      <w:r>
-        <w:rPr>
-          <w:sz w:val="28"/>
-          <w:szCs w:val="28"/>
-        </w:rPr>
-        <w:t xml:space="preserve">             Keep lane GREEN.</w:t>
-      </w:r>
-    </w:p>
-    <w:p>
-      <w:pPr>
-        <w:rPr>
-          <w:sz w:val="28"/>
-          <w:szCs w:val="28"/>
-        </w:rPr>
-      </w:pPr>
-      <w:r>
-        <w:rPr>
-          <w:sz w:val="28"/>
-          <w:szCs w:val="28"/>
-        </w:rPr>
-        <w:t xml:space="preserve">             Allow emergency vehicle to pass.</w:t>
-      </w:r>
-    </w:p>
-    <w:p>
-      <w:pPr>
-        <w:rPr>
-          <w:sz w:val="28"/>
-          <w:szCs w:val="28"/>
-        </w:rPr>
-      </w:pPr>
-      <w:r>
-        <w:rPr>
-          <w:sz w:val="28"/>
-          <w:szCs w:val="28"/>
-        </w:rPr>
-        <w:t xml:space="preserve">       </w:t>
-      </w:r>
-    </w:p>
-    <w:p>
-      <w:pPr>
-        <w:rPr>
-          <w:sz w:val="28"/>
-          <w:szCs w:val="28"/>
-        </w:rPr>
-      </w:pPr>
-      <w:r>
-        <w:rPr>
-          <w:sz w:val="28"/>
-          <w:szCs w:val="28"/>
-        </w:rPr>
-        <w:t xml:space="preserve">       After emergency vehicle clears:</w:t>
-      </w:r>
-    </w:p>
-    <w:p>
-      <w:pPr>
-        <w:rPr>
-          <w:sz w:val="28"/>
-          <w:szCs w:val="28"/>
-        </w:rPr>
-      </w:pPr>
-      <w:r>
-        <w:rPr>
-          <w:sz w:val="28"/>
-          <w:szCs w:val="28"/>
-        </w:rPr>
-        <w:t xml:space="preserve">             Wait emergency clearance period.</w:t>
-      </w:r>
-    </w:p>
-    <w:p>
-      <w:pPr>
-        <w:rPr>
-          <w:sz w:val="28"/>
-          <w:szCs w:val="28"/>
-        </w:rPr>
-      </w:pPr>
-      <w:r>
-        <w:rPr>
-          <w:sz w:val="28"/>
-          <w:szCs w:val="28"/>
-        </w:rPr>
-        <w:t xml:space="preserve">             Change GREEN → YELLOW → ALL RED.</w:t>
-      </w:r>
-    </w:p>
-    <w:p>
-      <w:pPr>
-        <w:rPr>
-          <w:color w:val="EE0000"/>
-          <w:sz w:val="28"/>
-          <w:szCs w:val="28"/>
-        </w:rPr>
-      </w:pPr>
-      <w:r>
-        <w:rPr>
-          <w:sz w:val="28"/>
-          <w:szCs w:val="28"/>
-        </w:rPr>
-        <w:t xml:space="preserve">19. </w:t>
-      </w:r>
-      <w:r>
-        <w:rPr>
-          <w:color w:val="EE0000"/>
-          <w:sz w:val="28"/>
-          <w:szCs w:val="28"/>
-        </w:rPr>
-        <w:t>ELSE IF emergency vehicle is in a RED LANE:</w:t>
-      </w:r>
-    </w:p>
-    <w:p>
-      <w:pPr>
-        <w:rPr>
-          <w:sz w:val="28"/>
-          <w:szCs w:val="28"/>
-        </w:rPr>
-      </w:pPr>
-      <w:r>
-        <w:rPr>
-          <w:sz w:val="28"/>
-          <w:szCs w:val="28"/>
-        </w:rPr>
-        <w:t xml:space="preserve">       Do not modify the current green timer.</w:t>
-      </w:r>
-    </w:p>
-    <w:p>
-      <w:pPr>
-        <w:rPr>
-          <w:sz w:val="28"/>
-          <w:szCs w:val="28"/>
-        </w:rPr>
-      </w:pPr>
-      <w:r>
-        <w:rPr>
-          <w:sz w:val="28"/>
-          <w:szCs w:val="28"/>
-        </w:rPr>
-        <w:t xml:space="preserve">       Allow current green timer to finish.</w:t>
-      </w:r>
-    </w:p>
-    <w:p>
-      <w:pPr>
-        <w:rPr>
-          <w:sz w:val="28"/>
-          <w:szCs w:val="28"/>
-        </w:rPr>
-      </w:pPr>
-      <w:r>
-        <w:rPr>
-          <w:sz w:val="28"/>
-          <w:szCs w:val="28"/>
-        </w:rPr>
-        <w:t xml:space="preserve">       Change:</w:t>
-      </w:r>
-    </w:p>
-    <w:p>
-      <w:pPr>
-        <w:rPr>
-          <w:sz w:val="28"/>
-          <w:szCs w:val="28"/>
-        </w:rPr>
-      </w:pPr>
-      <w:r>
-        <w:rPr>
-          <w:sz w:val="28"/>
-          <w:szCs w:val="28"/>
-        </w:rPr>
-        <w:t xml:space="preserve">             GREEN → YELLOW → ALL RED</w:t>
-      </w:r>
-    </w:p>
-    <w:p>
-      <w:pPr>
-        <w:rPr>
-          <w:sz w:val="28"/>
-          <w:szCs w:val="28"/>
-        </w:rPr>
-      </w:pPr>
-      <w:r>
-        <w:rPr>
-          <w:sz w:val="28"/>
-          <w:szCs w:val="28"/>
-        </w:rPr>
-        <w:t xml:space="preserve">       Give GREEN to emergency lane</w:t>
-      </w:r>
-    </w:p>
-    <w:p>
-      <w:pPr>
-        <w:rPr>
-          <w:sz w:val="28"/>
-          <w:szCs w:val="28"/>
-        </w:rPr>
-      </w:pPr>
-      <w:r>
-        <w:rPr>
-          <w:sz w:val="28"/>
-          <w:szCs w:val="28"/>
-        </w:rPr>
-        <w:t>20. Monitor emergency vehicle continuously.</w:t>
-      </w:r>
-    </w:p>
-    <w:p>
-      <w:pPr>
-        <w:rPr>
-          <w:sz w:val="28"/>
-          <w:szCs w:val="28"/>
-        </w:rPr>
-      </w:pPr>
-      <w:r>
-        <w:rPr>
-          <w:sz w:val="28"/>
-          <w:szCs w:val="28"/>
-        </w:rPr>
-        <w:t>21. Confirm that emergency vehicle has cleared the ROI.</w:t>
-      </w:r>
-    </w:p>
-    <w:p>
-      <w:pPr>
-        <w:rPr>
-          <w:sz w:val="28"/>
-          <w:szCs w:val="28"/>
-        </w:rPr>
-      </w:pPr>
-      <w:r>
-        <w:rPr>
-          <w:sz w:val="28"/>
-          <w:szCs w:val="28"/>
-        </w:rPr>
-        <w:t>22. Provide the defined 6–7 second emergency clearance period.</w:t>
-      </w:r>
-    </w:p>
-    <w:p>
-      <w:pPr>
-        <w:rPr>
-          <w:sz w:val="28"/>
-          <w:szCs w:val="28"/>
-        </w:rPr>
-      </w:pPr>
-      <w:r>
-        <w:rPr>
-          <w:sz w:val="28"/>
-          <w:szCs w:val="28"/>
-        </w:rPr>
-        <w:t>23. If another emergency vehicle is present:</w:t>
-      </w:r>
-    </w:p>
-    <w:p>
-      <w:pPr>
-        <w:rPr>
-          <w:sz w:val="28"/>
-          <w:szCs w:val="28"/>
-        </w:rPr>
-      </w:pPr>
-      <w:r>
-        <w:rPr>
-          <w:sz w:val="28"/>
-          <w:szCs w:val="28"/>
-        </w:rPr>
-        <w:t xml:space="preserve">       Recalculate its priority.</w:t>
-      </w:r>
-    </w:p>
-    <w:p>
-      <w:pPr>
-        <w:rPr>
-          <w:sz w:val="28"/>
-          <w:szCs w:val="28"/>
-        </w:rPr>
-      </w:pPr>
-      <w:r>
-        <w:rPr>
-          <w:sz w:val="28"/>
-          <w:szCs w:val="28"/>
-        </w:rPr>
-        <w:t xml:space="preserve">       Repeat emergency handling.</w:t>
-      </w:r>
-    </w:p>
-    <w:p>
-      <w:pPr>
-        <w:rPr>
-          <w:sz w:val="28"/>
-          <w:szCs w:val="28"/>
-        </w:rPr>
-      </w:pPr>
-      <w:r>
-        <w:rPr>
-          <w:sz w:val="28"/>
-          <w:szCs w:val="28"/>
-        </w:rPr>
-        <w:t>24. If no emergency vehicle remains:</w:t>
-      </w:r>
-    </w:p>
-    <w:p>
-      <w:pPr>
-        <w:rPr>
-          <w:sz w:val="28"/>
-          <w:szCs w:val="28"/>
-        </w:rPr>
-      </w:pPr>
-      <w:r>
-        <w:rPr>
-          <w:sz w:val="28"/>
-          <w:szCs w:val="28"/>
-        </w:rPr>
-        <w:t xml:space="preserve">       Exit EMERGENCY MODE.</w:t>
-      </w:r>
-    </w:p>
-    <w:p>
-      <w:pPr>
-        <w:rPr>
-          <w:sz w:val="28"/>
-          <w:szCs w:val="28"/>
-        </w:rPr>
-      </w:pPr>
-      <w:r>
-        <w:rPr>
-          <w:sz w:val="28"/>
-          <w:szCs w:val="28"/>
-        </w:rPr>
-        <w:t>25. Enter NORMAL MODE.</w:t>
-      </w:r>
-    </w:p>
-    <w:p>
-      <w:pPr>
-        <w:rPr>
-          <w:sz w:val="28"/>
-          <w:szCs w:val="28"/>
-        </w:rPr>
-      </w:pPr>
-      <w:r>
-        <w:rPr>
-          <w:sz w:val="28"/>
-          <w:szCs w:val="28"/>
-        </w:rPr>
-        <w:t>26. Recalculate traffic information for all lanes:</w:t>
-      </w:r>
-    </w:p>
-    <w:p>
-      <w:pPr>
-        <w:rPr>
-          <w:sz w:val="28"/>
-          <w:szCs w:val="28"/>
-        </w:rPr>
-      </w:pPr>
-      <w:r>
-        <w:rPr>
-          <w:sz w:val="28"/>
-          <w:szCs w:val="28"/>
-        </w:rPr>
-        <w:t xml:space="preserve">       Vehicle </w:t>
-      </w:r>
-      <w:proofErr w:type="gramStart"/>
-      <w:r>
-        <w:rPr>
-          <w:sz w:val="28"/>
-          <w:szCs w:val="28"/>
-        </w:rPr>
-        <w:t>Count</w:t>
-      </w:r>
-      <w:r>
-        <w:rPr>
-          <w:sz w:val="28"/>
-          <w:szCs w:val="28"/>
-        </w:rPr>
-        <w:t xml:space="preserve"> ,</w:t>
-      </w:r>
-      <w:proofErr w:type="gramEnd"/>
-      <w:r>
-        <w:rPr>
-          <w:sz w:val="28"/>
-          <w:szCs w:val="28"/>
-        </w:rPr>
-        <w:t xml:space="preserve"> </w:t>
-      </w:r>
-      <w:r>
-        <w:rPr>
-          <w:sz w:val="28"/>
-          <w:szCs w:val="28"/>
-        </w:rPr>
-        <w:t xml:space="preserve">Vehicle </w:t>
-      </w:r>
-      <w:proofErr w:type="gramStart"/>
-      <w:r>
-        <w:rPr>
-          <w:sz w:val="28"/>
-          <w:szCs w:val="28"/>
-        </w:rPr>
-        <w:t>Type</w:t>
-      </w:r>
-      <w:r>
-        <w:rPr>
-          <w:sz w:val="28"/>
-          <w:szCs w:val="28"/>
-        </w:rPr>
-        <w:t xml:space="preserve"> ,</w:t>
-      </w:r>
-      <w:proofErr w:type="gramEnd"/>
-      <w:r>
-        <w:rPr>
-          <w:sz w:val="28"/>
-          <w:szCs w:val="28"/>
-        </w:rPr>
-        <w:t xml:space="preserve"> </w:t>
-      </w:r>
-      <w:r>
-        <w:rPr>
-          <w:sz w:val="28"/>
-          <w:szCs w:val="28"/>
-        </w:rPr>
-        <w:t xml:space="preserve">Traffic </w:t>
-      </w:r>
-      <w:proofErr w:type="gramStart"/>
-      <w:r>
-        <w:rPr>
-          <w:sz w:val="28"/>
-          <w:szCs w:val="28"/>
-        </w:rPr>
-        <w:t>Demand</w:t>
-      </w:r>
-      <w:r>
-        <w:rPr>
-          <w:sz w:val="28"/>
-          <w:szCs w:val="28"/>
-        </w:rPr>
-        <w:t xml:space="preserve"> ,</w:t>
-      </w:r>
-      <w:proofErr w:type="gramEnd"/>
-      <w:r>
-        <w:rPr>
-          <w:sz w:val="28"/>
-          <w:szCs w:val="28"/>
-        </w:rPr>
-        <w:t xml:space="preserve"> </w:t>
-      </w:r>
-      <w:r>
-        <w:rPr>
-          <w:color w:val="EE0000"/>
-          <w:sz w:val="28"/>
-          <w:szCs w:val="28"/>
-        </w:rPr>
-        <w:t xml:space="preserve">Queue </w:t>
-      </w:r>
-      <w:proofErr w:type="gramStart"/>
-      <w:r>
-        <w:rPr>
-          <w:color w:val="EE0000"/>
-          <w:sz w:val="28"/>
-          <w:szCs w:val="28"/>
-        </w:rPr>
-        <w:t>Length ,</w:t>
-      </w:r>
-      <w:proofErr w:type="gramEnd"/>
-      <w:r>
-        <w:rPr>
-          <w:color w:val="EE0000"/>
-          <w:sz w:val="28"/>
-          <w:szCs w:val="28"/>
-        </w:rPr>
-        <w:t xml:space="preserve"> Waiting Time</w:t>
-      </w:r>
-    </w:p>
-    <w:p>
-      <w:pPr>
-        <w:rPr>
-          <w:sz w:val="28"/>
-          <w:szCs w:val="28"/>
-        </w:rPr>
-      </w:pPr>
-      <w:r>
-        <w:rPr>
-          <w:sz w:val="28"/>
-          <w:szCs w:val="28"/>
-        </w:rPr>
-        <w:lastRenderedPageBreak/>
-        <w:t>27. Check maximum waiting condition.</w:t>
-      </w:r>
-    </w:p>
-    <w:p>
-      <w:pPr>
-        <w:rPr>
-          <w:sz w:val="28"/>
-          <w:szCs w:val="28"/>
-        </w:rPr>
-      </w:pPr>
-      <w:r>
-        <w:rPr>
-          <w:sz w:val="28"/>
-          <w:szCs w:val="28"/>
-        </w:rPr>
-        <w:t>28. Calculate priority score for each eligible lane.</w:t>
-      </w:r>
-    </w:p>
-    <w:p>
-      <w:pPr>
-        <w:rPr>
-          <w:sz w:val="28"/>
-          <w:szCs w:val="28"/>
-        </w:rPr>
-      </w:pPr>
-      <w:r>
-        <w:rPr>
-          <w:sz w:val="28"/>
-          <w:szCs w:val="28"/>
-        </w:rPr>
-        <w:t>29. Select the next lane:</w:t>
-      </w:r>
-    </w:p>
-    <w:p>
-      <w:pPr>
-        <w:rPr>
-          <w:sz w:val="28"/>
-          <w:szCs w:val="28"/>
-        </w:rPr>
-      </w:pPr>
-      <w:r>
-        <w:rPr>
-          <w:sz w:val="28"/>
-          <w:szCs w:val="28"/>
-        </w:rPr>
-        <w:t xml:space="preserve">       Highest priority → selected lane.</w:t>
-      </w:r>
-    </w:p>
-    <w:p>
-      <w:pPr>
-        <w:rPr>
-          <w:sz w:val="28"/>
-          <w:szCs w:val="28"/>
-        </w:rPr>
-      </w:pPr>
-      <w:r>
-        <w:rPr>
-          <w:sz w:val="28"/>
-          <w:szCs w:val="28"/>
-        </w:rPr>
-        <w:t xml:space="preserve">       If priority is approximately equal:</w:t>
-      </w:r>
-    </w:p>
-    <w:p>
-      <w:pPr>
-        <w:rPr>
-          <w:sz w:val="28"/>
-          <w:szCs w:val="28"/>
-        </w:rPr>
-      </w:pPr>
-      <w:r>
-        <w:rPr>
-          <w:sz w:val="28"/>
-          <w:szCs w:val="28"/>
-        </w:rPr>
-        <w:t xml:space="preserve">             Follow clockwise sequence.</w:t>
-      </w:r>
-    </w:p>
-    <w:p>
-      <w:pPr>
-        <w:rPr>
-          <w:sz w:val="28"/>
-          <w:szCs w:val="28"/>
-        </w:rPr>
-      </w:pPr>
-      <w:r>
-        <w:rPr>
-          <w:sz w:val="28"/>
-          <w:szCs w:val="28"/>
-        </w:rPr>
-        <w:t>30. Calculate green time for selected lane.</w:t>
-      </w:r>
-    </w:p>
-    <w:p>
-      <w:pPr>
-        <w:rPr>
-          <w:sz w:val="28"/>
-          <w:szCs w:val="28"/>
-        </w:rPr>
-      </w:pPr>
-      <w:r>
-        <w:rPr>
-          <w:sz w:val="28"/>
-          <w:szCs w:val="28"/>
-        </w:rPr>
         <w:t>31. Apply minimum and maximum green limits.</w:t>
       </w:r>
     </w:p>
@@ -7820,7 +7275,6 @@
           <w:sz w:val="28"/>
           <w:szCs w:val="28"/>
         </w:rPr>
-        <w:lastRenderedPageBreak/>
         <w:t>21. Overall Decision Hierarchy</w:t>
       </w:r>
     </w:p>
@@ -7948,6 +7402,7 @@
           <w:sz w:val="24"/>
           <w:szCs w:val="24"/>
         </w:rPr>
+        <w:lastRenderedPageBreak/>
         <w:t>↓                ↓</w:t>
       </w:r>
     </w:p>
@@ -7993,124 +7448,107 @@
       </w:pPr>
       <w:r>
         <w:rPr>
-          <w:color w:val="EE0000"/>
           <w:sz w:val="24"/>
           <w:szCs w:val="24"/>
         </w:rPr>
-        <w:t>Distance / ETA</w:t>
-      </w:r>
-      <w:r>
+        <w:t>Traffic Demand</w:t>
+      </w:r>
+    </w:p>
+    <w:p>
+      <w:pPr>
+        <w:jc w:val="center"/>
         <w:rPr>
           <w:sz w:val="24"/>
           <w:szCs w:val="24"/>
         </w:rPr>
-        <w:t xml:space="preserve">       Traffic Demand</w:t>
-      </w:r>
-    </w:p>
-    <w:p>
-      <w:pPr>
-        <w:jc w:val="center"/>
+      </w:pPr>
+      <w:r>
         <w:rPr>
           <w:sz w:val="24"/>
           <w:szCs w:val="24"/>
         </w:rPr>
-      </w:pPr>
-      <w:r>
+        <w:t>↓                ↓</w:t>
+      </w:r>
+    </w:p>
+    <w:p>
+      <w:pPr>
+        <w:jc w:val="center"/>
         <w:rPr>
           <w:sz w:val="24"/>
           <w:szCs w:val="24"/>
         </w:rPr>
-        <w:t>↓                ↓</w:t>
-      </w:r>
-    </w:p>
-    <w:p>
-      <w:pPr>
-        <w:jc w:val="center"/>
+      </w:pPr>
+      <w:r>
         <w:rPr>
           <w:sz w:val="24"/>
           <w:szCs w:val="24"/>
         </w:rPr>
-      </w:pPr>
-      <w:r>
+        <w:t>Emergency Lane      Queue Length</w:t>
+      </w:r>
+    </w:p>
+    <w:p>
+      <w:pPr>
+        <w:jc w:val="center"/>
         <w:rPr>
           <w:sz w:val="24"/>
           <w:szCs w:val="24"/>
         </w:rPr>
-        <w:t>Emergency Lane      Queue Length</w:t>
-      </w:r>
-    </w:p>
-    <w:p>
-      <w:pPr>
-        <w:jc w:val="center"/>
+      </w:pPr>
+      <w:r>
         <w:rPr>
           <w:sz w:val="24"/>
           <w:szCs w:val="24"/>
         </w:rPr>
-      </w:pPr>
-      <w:r>
+        <w:t>↓                ↓</w:t>
+      </w:r>
+    </w:p>
+    <w:p>
+      <w:pPr>
+        <w:jc w:val="center"/>
         <w:rPr>
           <w:sz w:val="24"/>
           <w:szCs w:val="24"/>
         </w:rPr>
-        <w:t>↓                ↓</w:t>
-      </w:r>
-    </w:p>
-    <w:p>
-      <w:pPr>
-        <w:jc w:val="center"/>
+      </w:pPr>
+      <w:r>
         <w:rPr>
           <w:sz w:val="24"/>
           <w:szCs w:val="24"/>
         </w:rPr>
-      </w:pPr>
-      <w:r>
+        <w:t>Safe Switch      Clockwise Order</w:t>
+      </w:r>
+    </w:p>
+    <w:p>
+      <w:pPr>
+        <w:jc w:val="center"/>
         <w:rPr>
           <w:sz w:val="24"/>
           <w:szCs w:val="24"/>
         </w:rPr>
-        <w:t>Safe Switch      Clockwise Order</w:t>
-      </w:r>
-    </w:p>
-    <w:p>
-      <w:pPr>
-        <w:jc w:val="center"/>
+      </w:pPr>
+      <w:r>
         <w:rPr>
           <w:sz w:val="24"/>
           <w:szCs w:val="24"/>
         </w:rPr>
-      </w:pPr>
-      <w:r>
+        <w:t>↓                ↓</w:t>
+      </w:r>
+    </w:p>
+    <w:p>
+      <w:pPr>
+        <w:jc w:val="center"/>
         <w:rPr>
           <w:sz w:val="24"/>
           <w:szCs w:val="24"/>
         </w:rPr>
-        <w:t>↓                ↓</w:t>
-      </w:r>
-    </w:p>
-    <w:p>
-      <w:pPr>
-        <w:jc w:val="center"/>
+      </w:pPr>
+      <w:r>
         <w:rPr>
           <w:sz w:val="24"/>
           <w:szCs w:val="24"/>
         </w:rPr>
-      </w:pPr>
-      <w:r>
-        <w:rPr>
-          <w:sz w:val="24"/>
-          <w:szCs w:val="24"/>
-        </w:rPr>
-        <w:t xml:space="preserve">GREEN           </w:t>
-      </w:r>
-      <w:proofErr w:type="spellStart"/>
-      <w:r>
-        <w:rPr>
-          <w:sz w:val="24"/>
-          <w:szCs w:val="24"/>
-        </w:rPr>
-        <w:t>GREEN</w:t>
-      </w:r>
-      <w:proofErr w:type="spellEnd"/>
+        <w:t>GREEN           GREEN</w:t>
+      </w:r>
     </w:p>
     <w:p>
       <w:pPr>
@@ -8368,7 +7806,6 @@
           <w:sz w:val="28"/>
           <w:szCs w:val="28"/>
         </w:rPr>
-        <w:lastRenderedPageBreak/>
         <w:t>22. Points Considered in Your Project</w:t>
       </w:r>
     </w:p>
@@ -8514,6 +7951,7 @@
           <w:sz w:val="28"/>
           <w:szCs w:val="28"/>
         </w:rPr>
+        <w:lastRenderedPageBreak/>
         <w:t xml:space="preserve">Queue length </w:t>
       </w:r>
     </w:p>
@@ -8980,7 +8418,6 @@
           <w:sz w:val="28"/>
           <w:szCs w:val="28"/>
         </w:rPr>
-        <w:lastRenderedPageBreak/>
         <w:t xml:space="preserve">Multiple emergency vehicles </w:t>
       </w:r>
     </w:p>
@@ -9114,6 +8551,7 @@
           <w:sz w:val="28"/>
           <w:szCs w:val="28"/>
         </w:rPr>
+        <w:lastRenderedPageBreak/>
         <w:t xml:space="preserve">Yellow phase before switching </w:t>
       </w:r>
     </w:p>

</xml_diff>